<commit_message>
docs: regenerate laboratory report for 5-expert variant with updated CLI listings
</commit_message>
<xml_diff>
--- a/Лабораторная_работа_1_Экспертные_оценки.docx
+++ b/Лабораторная_работа_1_Экспертные_оценки.docx
@@ -11774,11 +11774,20 @@
                 <w:color w:val="1E293B"/>
                 <w:sz w:val="16"/>
               </w:rPr>
-              <w:t>from typing import Callable, Dict, List, Optional, Tuple</w:t>
-              <w:br/>
-              <w:br/>
-              <w:t>import pandas as pd</w:t>
-              <w:br/>
+              <w:t># -*- coding: utf-8 -*-</w:t>
+              <w:br/>
+              <w:t>"""</w:t>
+              <w:br/>
+              <w:t>Модуль форматированного академического вывода результатов экспертного оценивания.</w:t>
+              <w:br/>
+              <w:t>Обеспечивает аккуратное табличное оформление, визуальное разделение этапов,</w:t>
+              <w:br/>
+              <w:t>содержательные математические пояснения и автоматическую итоговую интерпретацию.</w:t>
+              <w:br/>
+              <w:t>"""</w:t>
+              <w:br/>
+              <w:br/>
+              <w:t>from typing import Dict, List, Optional, Tuple</w:t>
               <w:br/>
               <w:t>from .named_matrix import NamedMatrix</w:t>
               <w:br/>
@@ -11786,7 +11795,129 @@
               <w:br/>
               <w:br/>
               <w:br/>
-              <w:t># ---------- общая таблица (pandas) ----------</w:t>
+              <w:t># =========================================================================</w:t>
+              <w:br/>
+              <w:t># ВСПОМОГАТЕЛЬНОЕ ОФОРМЛЕНИЕ ТАБЛИЦ И БАННЕРОВ</w:t>
+              <w:br/>
+              <w:t># =========================================================================</w:t>
+              <w:br/>
+              <w:br/>
+              <w:t>def print_header(title: str, subtitle: Optional[str] = None) -&gt; None:</w:t>
+              <w:br/>
+              <w:t xml:space="preserve">    """Выводит стилизованный заголовок этапа."""</w:t>
+              <w:br/>
+              <w:t xml:space="preserve">    width = max(76, len(title) + 6)</w:t>
+              <w:br/>
+              <w:t xml:space="preserve">    print()</w:t>
+              <w:br/>
+              <w:t xml:space="preserve">    print("═" * width)</w:t>
+              <w:br/>
+              <w:t xml:space="preserve">    print(f"  {title.upper()}")</w:t>
+              <w:br/>
+              <w:t xml:space="preserve">    if subtitle:</w:t>
+              <w:br/>
+              <w:t xml:space="preserve">        print(f"  {subtitle}")</w:t>
+              <w:br/>
+              <w:t xml:space="preserve">    print("═" * width)</w:t>
+              <w:br/>
+              <w:br/>
+              <w:br/>
+              <w:t>def print_note(text: str) -&gt; None:</w:t>
+              <w:br/>
+              <w:t xml:space="preserve">    """Выводит поясняющую подсказку или аналитический комментарий."""</w:t>
+              <w:br/>
+              <w:t xml:space="preserve">    print(f"\n💡 Пояснение: {text}")</w:t>
+              <w:br/>
+              <w:br/>
+              <w:br/>
+              <w:t>def format_box_table(</w:t>
+              <w:br/>
+              <w:t xml:space="preserve">    headers: List[str],</w:t>
+              <w:br/>
+              <w:t xml:space="preserve">    rows: List[List[object]],</w:t>
+              <w:br/>
+              <w:t xml:space="preserve">    aligns: Optional[List[str]] = None,</w:t>
+              <w:br/>
+              <w:t>) -&gt; str:</w:t>
+              <w:br/>
+              <w:t xml:space="preserve">    """</w:t>
+              <w:br/>
+              <w:t xml:space="preserve">    Формирует эстетичную таблицу в рамке Unicode.</w:t>
+              <w:br/>
+              <w:t xml:space="preserve">    aligns: список выравниваний для каждой колонки ('left', 'center', 'right').</w:t>
+              <w:br/>
+              <w:t xml:space="preserve">    """</w:t>
+              <w:br/>
+              <w:t xml:space="preserve">    str_headers = [str(h) for h in headers]</w:t>
+              <w:br/>
+              <w:t xml:space="preserve">    str_rows = [[str(cell) for cell in row] for row in rows]</w:t>
+              <w:br/>
+              <w:t xml:space="preserve">    num_cols = len(str_headers)</w:t>
+              <w:br/>
+              <w:br/>
+              <w:t xml:space="preserve">    if aligns is None:</w:t>
+              <w:br/>
+              <w:t xml:space="preserve">        aligns = ["left"] + ["center"] * (num_cols - 1)</w:t>
+              <w:br/>
+              <w:br/>
+              <w:t xml:space="preserve">    widths = [len(h) for h in str_headers]</w:t>
+              <w:br/>
+              <w:t xml:space="preserve">    for row in str_rows:</w:t>
+              <w:br/>
+              <w:t xml:space="preserve">        for j, cell in enumerate(row):</w:t>
+              <w:br/>
+              <w:t xml:space="preserve">            if j &lt; num_cols:</w:t>
+              <w:br/>
+              <w:t xml:space="preserve">                widths[j] = max(widths[j], len(cell))</w:t>
+              <w:br/>
+              <w:br/>
+              <w:t xml:space="preserve">    # Минимальная ширина ячейки для читаемости</w:t>
+              <w:br/>
+              <w:t xml:space="preserve">    widths = [max(w, 4) for w in widths]</w:t>
+              <w:br/>
+              <w:br/>
+              <w:t xml:space="preserve">    def pad_cell(text: str, width: int, align: str) -&gt; str:</w:t>
+              <w:br/>
+              <w:t xml:space="preserve">        if align == "center":</w:t>
+              <w:br/>
+              <w:t xml:space="preserve">            return text.center(width)</w:t>
+              <w:br/>
+              <w:t xml:space="preserve">        elif align == "right":</w:t>
+              <w:br/>
+              <w:t xml:space="preserve">            return text.rjust(width)</w:t>
+              <w:br/>
+              <w:t xml:space="preserve">        return text.ljust(width)</w:t>
+              <w:br/>
+              <w:br/>
+              <w:t xml:space="preserve">    top_border = "┌" + "┬".join("─" * (w + 2) for w in widths) + "┐"</w:t>
+              <w:br/>
+              <w:t xml:space="preserve">    header_sep = "├" + "┼".join("─" * (w + 2) for w in widths) + "┤"</w:t>
+              <w:br/>
+              <w:t xml:space="preserve">    bottom_border = "└" + "┴".join("─" * (w + 2) for w in widths) + "┘"</w:t>
+              <w:br/>
+              <w:br/>
+              <w:t xml:space="preserve">    header_line = "│" + "│".join(f" {pad_cell(h, widths[j], 'center')} " for j, h in enumerate(str_headers)) + "│"</w:t>
+              <w:br/>
+              <w:br/>
+              <w:t xml:space="preserve">    data_lines = []</w:t>
+              <w:br/>
+              <w:t xml:space="preserve">    for row in str_rows:</w:t>
+              <w:br/>
+              <w:t xml:space="preserve">        cells_padded = [</w:t>
+              <w:br/>
+              <w:t xml:space="preserve">            f" {pad_cell(row[j] if j &lt; len(row) else '', widths[j], aligns[j])} "</w:t>
+              <w:br/>
+              <w:t xml:space="preserve">            for j in range(num_cols)</w:t>
+              <w:br/>
+              <w:t xml:space="preserve">        ]</w:t>
+              <w:br/>
+              <w:t xml:space="preserve">        data_lines.append("│" + "│".join(cells_padded) + "│")</w:t>
+              <w:br/>
+              <w:br/>
+              <w:t xml:space="preserve">    lines = [top_border, header_line, header_sep] + data_lines + [bottom_border]</w:t>
+              <w:br/>
+              <w:t xml:space="preserve">    return "\n".join(lines)</w:t>
+              <w:br/>
               <w:br/>
               <w:br/>
               <w:t>def print_table(</w:t>
@@ -11799,532 +11930,594 @@
               <w:br/>
               <w:t>) -&gt; None:</w:t>
               <w:br/>
-              <w:t xml:space="preserve">    if aligns is None:</w:t>
-              <w:br/>
-              <w:t xml:space="preserve">        aligns = ["center"] + ["left"] * (len(columns) - 1)</w:t>
-              <w:br/>
-              <w:br/>
-              <w:t xml:space="preserve">    df = pd.DataFrame(rows, columns=columns)</w:t>
-              <w:br/>
-              <w:br/>
-              <w:t xml:space="preserve">    for col, align in zip(columns, aligns):</w:t>
-              <w:br/>
-              <w:t xml:space="preserve">        w = max(len(col), df[col].astype(str).str.len().max())</w:t>
-              <w:br/>
-              <w:t xml:space="preserve">        df[col] = df[col].astype(str).apply(</w:t>
-              <w:br/>
-              <w:t xml:space="preserve">            lambda s: s.center(w) if align == "center"</w:t>
-              <w:br/>
-              <w:t xml:space="preserve">            else s.rjust(w) if align == "right"</w:t>
-              <w:br/>
-              <w:t xml:space="preserve">            else s.ljust(w)</w:t>
-              <w:br/>
-              <w:t xml:space="preserve">        )</w:t>
-              <w:br/>
-              <w:t xml:space="preserve">        df.columns = [c.center(w) if c == col else c for c in df.columns]</w:t>
-              <w:br/>
-              <w:br/>
-              <w:t xml:space="preserve">    print(df.to_string(index=False))</w:t>
-              <w:br/>
-              <w:br/>
-              <w:t># ---------- исходные данные ----------</w:t>
+              <w:t xml:space="preserve">    """Универсальная печать таблицы (заменяет старый pandas-вывод на аккуратную рамку)."""</w:t>
+              <w:br/>
+              <w:t xml:space="preserve">    print(format_box_table(columns, rows, aligns))</w:t>
+              <w:br/>
+              <w:br/>
+              <w:br/>
+              <w:t># =========================================================================</w:t>
+              <w:br/>
+              <w:t># 1. ИСХОДНЫЕ ДАННЫЕ И МАТРИЦА РАНГОВ</w:t>
+              <w:br/>
+              <w:t># =========================================================================</w:t>
               <w:br/>
               <w:br/>
               <w:t>def print_raw_data(table: Dict[int, List[str]]) -&gt; None:</w:t>
               <w:br/>
-              <w:t xml:space="preserve">    rows = [(num, " ".join(ranks)) for num, ranks in table.items()]</w:t>
-              <w:br/>
-              <w:t xml:space="preserve">    print_table(rows, ["Номер эксперта", "Мнение эксперта"], ["center", "left"])</w:t>
+              <w:t xml:space="preserve">    """Выводит исходные протоколы ранжирования экспертов."""</w:t>
+              <w:br/>
+              <w:t xml:space="preserve">    print_header("1. ИСХОДНЫЕ СУЖДЕНИЯ ЭКСПЕРТОВ", "Суждения экспертов упорядочены от наиболее предпочтительного к наименее")</w:t>
+              <w:br/>
+              <w:t xml:space="preserve">    rows = []</w:t>
+              <w:br/>
+              <w:t xml:space="preserve">    for num, ranks in sorted(table.items()):</w:t>
+              <w:br/>
+              <w:t xml:space="preserve">        order_str = " ≻ ".join(ranks)</w:t>
+              <w:br/>
+              <w:t xml:space="preserve">        rows.append([f"Эксперт Э{num}", order_str, " ".join(ranks)])</w:t>
+              <w:br/>
+              <w:br/>
+              <w:t xml:space="preserve">    print(format_box_table(["Эксперт", "Индивидуальный порядок предпочтений", "Вектор"], rows, ["center", "left", "center"]))</w:t>
+              <w:br/>
+              <w:t xml:space="preserve">    print_note("Символ '≻' означает строгое предпочтение: первая альтернатива в строке признана наилучшей.")</w:t>
+              <w:br/>
               <w:br/>
               <w:br/>
               <w:t>def print_transformed_data(table: Dict[int, Dict[str, int]], objects: List[str]) -&gt; None:</w:t>
               <w:br/>
-              <w:t xml:space="preserve">    """Матрица «Эксперт × Объект» с рангами."""</w:t>
+              <w:t xml:space="preserve">    """Матрица «Эксперт × Объект» с числовыми рангами."""</w:t>
+              <w:br/>
+              <w:t xml:space="preserve">    print("\n┌── Матрица рангов объектов (Эксперт × Объект) ──────────────────────────────┐")</w:t>
               <w:br/>
               <w:t xml:space="preserve">    columns = ["Эксперт"] + objects</w:t>
               <w:br/>
-              <w:br/>
-              <w:t xml:space="preserve">    rows = [</w:t>
-              <w:br/>
-              <w:t xml:space="preserve">        [f"Э{num}"] + [str(ranks.get(obj, "—")) for obj in objects]</w:t>
-              <w:br/>
-              <w:t xml:space="preserve">        for num, ranks in table.items()</w:t>
-              <w:br/>
-              <w:t xml:space="preserve">    ]</w:t>
-              <w:br/>
-              <w:br/>
-              <w:t xml:space="preserve">    widths = [</w:t>
-              <w:br/>
-              <w:t xml:space="preserve">        max(len(col), max(len(r[i]) for r in rows))</w:t>
-              <w:br/>
-              <w:t xml:space="preserve">        for i, col in enumerate(columns)</w:t>
-              <w:br/>
-              <w:t xml:space="preserve">    ]</w:t>
-              <w:br/>
-              <w:br/>
-              <w:t xml:space="preserve">    aligns = ["right"] + ["center"] * len(objects)</w:t>
-              <w:br/>
-              <w:br/>
-              <w:t xml:space="preserve">    def fmt(cells):</w:t>
-              <w:br/>
-              <w:t xml:space="preserve">        parts = []</w:t>
-              <w:br/>
-              <w:t xml:space="preserve">        for cell, w, align in zip(cells, widths, aligns):</w:t>
-              <w:br/>
-              <w:t xml:space="preserve">            if align == "center":</w:t>
-              <w:br/>
-              <w:t xml:space="preserve">                parts.append(cell.center(w))</w:t>
-              <w:br/>
-              <w:t xml:space="preserve">            elif align == "right":</w:t>
-              <w:br/>
-              <w:t xml:space="preserve">                parts.append(cell.rjust(w))</w:t>
-              <w:br/>
-              <w:t xml:space="preserve">            else:</w:t>
-              <w:br/>
-              <w:t xml:space="preserve">                parts.append(cell.ljust(w))</w:t>
-              <w:br/>
-              <w:t xml:space="preserve">        return "  ".join(parts)</w:t>
-              <w:br/>
-              <w:br/>
-              <w:t xml:space="preserve">    print()</w:t>
-              <w:br/>
-              <w:t xml:space="preserve">    print(fmt(columns))</w:t>
-              <w:br/>
-              <w:t xml:space="preserve">    print("-" * (sum(widths) + 2 * (len(widths) - 1)))</w:t>
-              <w:br/>
-              <w:t xml:space="preserve">    for row in rows:</w:t>
-              <w:br/>
-              <w:t xml:space="preserve">        print(fmt(row))</w:t>
-              <w:br/>
-              <w:br/>
-              <w:t># ---------- ранжирования по среднему/медиане ----------</w:t>
+              <w:t xml:space="preserve">    rows = []</w:t>
+              <w:br/>
+              <w:t xml:space="preserve">    for num in sorted(table.keys()):</w:t>
+              <w:br/>
+              <w:t xml:space="preserve">        ranks = table[num]</w:t>
+              <w:br/>
+              <w:t xml:space="preserve">        rows.append([f"Э{num}"] + [ranks.get(obj, "—") for obj in objects])</w:t>
+              <w:br/>
+              <w:br/>
+              <w:t xml:space="preserve">    print(format_box_table(columns, rows, ["center"] * len(columns)))</w:t>
+              <w:br/>
+              <w:t xml:space="preserve">    print_note("Ранг 1 присвоен наилучшей альтернативе, максимальный ранг — наихудшей.")</w:t>
+              <w:br/>
+              <w:br/>
+              <w:br/>
+              <w:t># =========================================================================</w:t>
+              <w:br/>
+              <w:t># 2. СРЕДНИЕ И МЕДИАННЫЕ РАНГИ</w:t>
+              <w:br/>
+              <w:t># =========================================================================</w:t>
               <w:br/>
               <w:br/>
               <w:t>def print_ranking(title: str, places: List[Tuple[int, str, float]], unit: str) -&gt; None:</w:t>
               <w:br/>
-              <w:t xml:space="preserve">    print(f"\n{title}:")</w:t>
-              <w:br/>
-              <w:t xml:space="preserve">    for place, obj, value in places:</w:t>
-              <w:br/>
-              <w:t xml:space="preserve">        print(f"  {place}. {obj}  ({unit} = {value:.2f})")</w:t>
+              <w:t xml:space="preserve">    """Табличный вывод результатов ранжирования по среднему/медиане."""</w:t>
+              <w:br/>
+              <w:t xml:space="preserve">    rows = []</w:t>
+              <w:br/>
+              <w:t xml:space="preserve">    for place, obj, val in places:</w:t>
+              <w:br/>
+              <w:t xml:space="preserve">        rows.append([f"{place} место", obj, f"{val:.2f}"])</w:t>
+              <w:br/>
+              <w:br/>
+              <w:t xml:space="preserve">    print(format_box_table(["Позиция", "Альтернатива", f"Значение ({unit})"], rows, ["center", "center", "right"]))</w:t>
+              <w:br/>
               <w:br/>
               <w:br/>
               <w:t>def print_ranking_by_average(ranks_avg: Dict[str, float]) -&gt; None:</w:t>
               <w:br/>
+              <w:t xml:space="preserve">    """Метод средних арифметических рангов."""</w:t>
+              <w:br/>
               <w:t xml:space="preserve">    places = assign_places(get_sorted_by_rank(ranks_avg))</w:t>
               <w:br/>
-              <w:t xml:space="preserve">    print_ranking("Итоговое ранжирование по среднему", places, "средний ранг")</w:t>
+              <w:t xml:space="preserve">    print_header("2. МЕТОД СРЕДНИХ АРИФМЕТИЧЕСКИХ РАНГОВ", "Агрегирование мнений на основе статистического усреднения баллов")</w:t>
+              <w:br/>
+              <w:t xml:space="preserve">    print_ranking("Итоговое ранжирование по среднему баллу", places, "средний ранг")</w:t>
+              <w:br/>
+              <w:t xml:space="preserve">    lead_obj = places[0][1]</w:t>
+              <w:br/>
+              <w:t xml:space="preserve">    lead_val = places[0][2]</w:t>
+              <w:br/>
+              <w:t xml:space="preserve">    print_note(f"Альтернатива {lead_obj} получила минимальный средний балл ({lead_val:.2f}) и заняла 1-е место. Чем меньше r̄, тем выше приоритет.")</w:t>
+              <w:br/>
               <w:br/>
               <w:br/>
               <w:t>def print_ranking_by_median(ranks_median: Dict[str, float]) -&gt; None:</w:t>
               <w:br/>
+              <w:t xml:space="preserve">    """Метод медианных рангов."""</w:t>
+              <w:br/>
               <w:t xml:space="preserve">    places = assign_places(get_sorted_by_rank(ranks_median))</w:t>
               <w:br/>
-              <w:t xml:space="preserve">    print_ranking("Итоговое ранжирование по медиане", places, "медиана")</w:t>
-              <w:br/>
-              <w:br/>
-              <w:t># ---------- матрицы ----------</w:t>
+              <w:t xml:space="preserve">    print_header("3. МЕТОД МЕДИАННЫХ РАНГОВ", "Робастная порядковая статистика (квантиль порядка 0.5)")</w:t>
+              <w:br/>
+              <w:t xml:space="preserve">    print_ranking("Итоговое ранжирование по медиане", places, "медианный ранг")</w:t>
+              <w:br/>
+              <w:t xml:space="preserve">    print_note("Медианный ранг устойчив к единичным выбросам и смещённым суждениям отдельных экспертов комиссии.")</w:t>
+              <w:br/>
+              <w:br/>
+              <w:br/>
+              <w:t># =========================================================================</w:t>
+              <w:br/>
+              <w:t># 3. ВЕКТОРЫ ПРЕДПОЧТЕНИЙ И МАТРИЦА ПОТЕРЬ</w:t>
+              <w:br/>
+              <w:t># =========================================================================</w:t>
               <w:br/>
               <w:br/>
               <w:t>def print_preference_vectors(preference_vectors: Dict[int, Dict[str, int]], objects: List[str]) -&gt; None:</w:t>
               <w:br/>
-              <w:t xml:space="preserve">    """Матрица «Эксперт × Объект» с векторами предпочтений π^(k)."""</w:t>
+              <w:t xml:space="preserve">    """Матрица векторов предпочтений π^(k)."""</w:t>
+              <w:br/>
+              <w:t xml:space="preserve">    print_header("5. ВЕКТОРЫ ПРЕДПОЧТЕНИЙ π^(k)", "π_i^(k) указывает количество альтернатив, которые эксперт k счёл СТРОГО ЛУЧШЕ a_i")</w:t>
               <w:br/>
               <w:t xml:space="preserve">    columns = ["Эксперт"] + objects</w:t>
               <w:br/>
-              <w:br/>
-              <w:t xml:space="preserve">    rows = [</w:t>
-              <w:br/>
-              <w:t xml:space="preserve">        [f"Э{num}"] + [str(pv.get(obj, "—")) for obj in objects]</w:t>
-              <w:br/>
-              <w:t xml:space="preserve">        for num, pv in preference_vectors.items()</w:t>
-              <w:br/>
-              <w:t xml:space="preserve">    ]</w:t>
-              <w:br/>
-              <w:br/>
-              <w:t xml:space="preserve">    widths = [</w:t>
-              <w:br/>
-              <w:t xml:space="preserve">        max(len(col), max(len(r[i]) for r in rows))</w:t>
-              <w:br/>
-              <w:t xml:space="preserve">        for i, col in enumerate(columns)</w:t>
-              <w:br/>
-              <w:t xml:space="preserve">    ]</w:t>
-              <w:br/>
-              <w:br/>
-              <w:t xml:space="preserve">    aligns = ["right"] + ["center"] * len(objects)</w:t>
-              <w:br/>
-              <w:br/>
-              <w:t xml:space="preserve">    def fmt(cells):</w:t>
-              <w:br/>
-              <w:t xml:space="preserve">        parts = []</w:t>
-              <w:br/>
-              <w:t xml:space="preserve">        for cell, w, align in zip(cells, widths, aligns):</w:t>
-              <w:br/>
-              <w:t xml:space="preserve">            if align == "center":</w:t>
-              <w:br/>
-              <w:t xml:space="preserve">                parts.append(cell.center(w))</w:t>
-              <w:br/>
-              <w:t xml:space="preserve">            elif align == "right":</w:t>
-              <w:br/>
-              <w:t xml:space="preserve">                parts.append(cell.rjust(w))</w:t>
-              <w:br/>
-              <w:t xml:space="preserve">            else:</w:t>
-              <w:br/>
-              <w:t xml:space="preserve">                parts.append(cell.ljust(w))</w:t>
-              <w:br/>
-              <w:t xml:space="preserve">        return "  ".join(parts)</w:t>
-              <w:br/>
-              <w:br/>
-              <w:t xml:space="preserve">    print("\nВекторы предпочтений π^(k)  (π_i = сколько объектов ЛУЧШЕ, чем a_i):")</w:t>
-              <w:br/>
-              <w:t xml:space="preserve">    print()</w:t>
-              <w:br/>
-              <w:t xml:space="preserve">    print(fmt(columns))</w:t>
-              <w:br/>
-              <w:t xml:space="preserve">    print("-" * (sum(widths) + 2 * (len(widths) - 1)))</w:t>
-              <w:br/>
-              <w:t xml:space="preserve">    for row in rows:</w:t>
-              <w:br/>
-              <w:t xml:space="preserve">        print(fmt(row))</w:t>
+              <w:t xml:space="preserve">    rows = []</w:t>
+              <w:br/>
+              <w:t xml:space="preserve">    for num in sorted(preference_vectors.keys()):</w:t>
+              <w:br/>
+              <w:t xml:space="preserve">        pv = preference_vectors[num]</w:t>
+              <w:br/>
+              <w:t xml:space="preserve">        rows.append([f"Э{num}"] + [pv.get(obj, 0) for obj in objects])</w:t>
+              <w:br/>
+              <w:br/>
+              <w:t xml:space="preserve">    print(format_box_table(columns, rows, ["center"] * len(columns)))</w:t>
+              <w:br/>
+              <w:t xml:space="preserve">    print_note("Для строгого упорядочения без связок значение π_i всегда равно (r_i - 1). Лучший объект имеет π = 0.")</w:t>
+              <w:br/>
+              <w:br/>
+              <w:br/>
+              <w:t># =========================================================================</w:t>
+              <w:br/>
+              <w:t># 4. БИНАРНЫЕ ОТНОШЕНИЯ И РАССТОЯНИЯ КЕМЕНИ</w:t>
+              <w:br/>
+              <w:t># =========================================================================</w:t>
               <w:br/>
               <w:br/>
               <w:t>def print_binary_relations(relations: Dict[int, NamedMatrix]) -&gt; None:</w:t>
               <w:br/>
-              <w:t xml:space="preserve">    for expert, m in relations.items():</w:t>
-              <w:br/>
-              <w:t xml:space="preserve">        print(f"\nЭксперт Э{expert}:")</w:t>
-              <w:br/>
-              <w:t xml:space="preserve">        print(m)</w:t>
+              <w:t xml:space="preserve">    """Печать квадратных матриц бинарных отношений A_k."""</w:t>
+              <w:br/>
+              <w:t xml:space="preserve">    print_header("4. БИНАРНЫЕ ОТНОШЕНИЯ И РАССТОЯНИЯ КЕМЕНИ", "Отношение нестрогого доминирования: x_ij = 1, если r_i &gt;= r_j; иначе 0")</w:t>
+              <w:br/>
+              <w:t xml:space="preserve">    for expert, m in sorted(relations.items()):</w:t>
+              <w:br/>
+              <w:t xml:space="preserve">        print(f"\n┌── Эксперт Э{expert} ───────────────────────────────────────┐")</w:t>
+              <w:br/>
+              <w:t xml:space="preserve">        cols = m.cols</w:t>
+              <w:br/>
+              <w:t xml:space="preserve">        matrix_rows = [[r] + [m[r, c] for c in cols] for r in m.rows]</w:t>
+              <w:br/>
+              <w:t xml:space="preserve">        print(format_box_table([" "] + cols, matrix_rows, ["center"] * (len(cols) + 1)))</w:t>
+              <w:br/>
+              <w:t xml:space="preserve">    print_note("Диагональ всегда равна 1 (x_ii = 1). Элемент x_ij = 0 означает, что объект a_i строго лучше объекта a_j.")</w:t>
+              <w:br/>
               <w:br/>
               <w:br/>
               <w:t>def print_distance_matrix(distances: NamedMatrix) -&gt; None:</w:t>
               <w:br/>
-              <w:t xml:space="preserve">    print("\nМатрица расстояний Кемени между экспертами:")</w:t>
-              <w:br/>
-              <w:t xml:space="preserve">    print(distances)</w:t>
+              <w:t xml:space="preserve">    """Матрица попарных расстояний Кемени между экспертами."""</w:t>
+              <w:br/>
+              <w:t xml:space="preserve">    print("\n┌── Матрица попарных расстояний Кемени D ────────────────────────────────┐")</w:t>
+              <w:br/>
+              <w:t xml:space="preserve">    cols = distances.cols</w:t>
+              <w:br/>
+              <w:t xml:space="preserve">    rows = []</w:t>
+              <w:br/>
+              <w:t xml:space="preserve">    for r in distances.rows:</w:t>
+              <w:br/>
+              <w:t xml:space="preserve">        row_sum = sum(distances[r, c] for c in cols)</w:t>
+              <w:br/>
+              <w:t xml:space="preserve">        rows.append([f"Э{r}"] + [distances[r, c] for c in cols] + [row_sum])</w:t>
+              <w:br/>
+              <w:br/>
+              <w:t xml:space="preserve">    headers = ["Эксперт"] + [f"Э{c}" for c in cols] + ["Сумма S_k"]</w:t>
+              <w:br/>
+              <w:t xml:space="preserve">    print(format_box_table(headers, rows, ["center"] * len(headers)))</w:t>
+              <w:br/>
+              <w:t xml:space="preserve">    print_note("d(A, B) = ∑ |a_ij - b_ij| = 2 · I(A, B), где I — число инверсий. Диагональ равна 0.")</w:t>
+              <w:br/>
               <w:br/>
               <w:br/>
               <w:t>def print_diff_relations_matrixes(diffs: Dict[Tuple[int, int], NamedMatrix], distances: NamedMatrix) -&gt; None:</w:t>
               <w:br/>
-              <w:t xml:space="preserve">    for (k1, k2), diff in diffs.items():</w:t>
+              <w:t xml:space="preserve">    """Матрицы попарных модулей разностей |A - B|."""</w:t>
+              <w:br/>
+              <w:t xml:space="preserve">    print_header("МАТРИЦЫ РАЗНОСТЕЙ |A_k1 - A_k2|", "Показывают ячейки несовпадения суждений между парами экспертов")</w:t>
+              <w:br/>
+              <w:t xml:space="preserve">    for (k1, k2), diff in sorted(diffs.items()):</w:t>
               <w:br/>
               <w:t xml:space="preserve">        d = distances[str(k1), str(k2)]</w:t>
               <w:br/>
-              <w:t xml:space="preserve">        print(f"\n|Э{k1} − Э{k2}|  (d = {d}):")</w:t>
-              <w:br/>
-              <w:t xml:space="preserve">        print(diff)</w:t>
-              <w:br/>
-              <w:br/>
-              <w:t># ---------- медианы Кемени ----------</w:t>
-              <w:br/>
-              <w:br/>
-              <w:t>def print_kemeny_median_by_experts(distances: NamedMatrix, transformed: Dict[int, Dict[str, int]], medians: List[str], sums: Dict[str, int]) -&gt; None:</w:t>
-              <w:br/>
-              <w:t xml:space="preserve">    print("\nСуммы расстояний по строкам матрицы D:")</w:t>
+              <w:t xml:space="preserve">        print(f"\n┌── Разность |Э{k1} − Э{k2}|  (расстояние Кемени d = {d}) ────┐")</w:t>
+              <w:br/>
+              <w:t xml:space="preserve">        cols = diff.cols</w:t>
+              <w:br/>
+              <w:t xml:space="preserve">        matrix_rows = [[r] + [diff[r, c] for c in cols] for r in diff.rows]</w:t>
+              <w:br/>
+              <w:t xml:space="preserve">        print(format_box_table([" "] + cols, matrix_rows, ["center"] * (len(cols) + 1)))</w:t>
+              <w:br/>
+              <w:br/>
+              <w:br/>
+              <w:t>def print_kemeny_median_by_experts(</w:t>
+              <w:br/>
+              <w:t xml:space="preserve">    distances: NamedMatrix,</w:t>
+              <w:br/>
+              <w:t xml:space="preserve">    transformed: Dict[int, Dict[str, int]],</w:t>
+              <w:br/>
+              <w:t xml:space="preserve">    medians: List[str],</w:t>
+              <w:br/>
+              <w:t xml:space="preserve">    sums: Dict[str, int],</w:t>
+              <w:br/>
+              <w:t>) -&gt; None:</w:t>
+              <w:br/>
+              <w:t xml:space="preserve">    """Медиана Кемени на множестве заданных мнений экспертов."""</w:t>
+              <w:br/>
+              <w:t xml:space="preserve">    print("\n┌── Медианы Кемени среди мнений экспертов ───────────────────────────────┐")</w:t>
               <w:br/>
               <w:t xml:space="preserve">    best = min(sums.values())</w:t>
               <w:br/>
-              <w:t xml:space="preserve">    for expert, s in sums.items():</w:t>
-              <w:br/>
-              <w:t xml:space="preserve">        marker = " ←" if s == best else ""</w:t>
-              <w:br/>
-              <w:t xml:space="preserve">        print(f"  Э{expert}: S = {s}{marker}")</w:t>
-              <w:br/>
-              <w:br/>
-              <w:t xml:space="preserve">    if len(medians) == 1:</w:t>
-              <w:br/>
-              <w:t xml:space="preserve">        print(f"\nМедиана Кемени (среди экспертов): Э{medians[0]}")</w:t>
+              <w:t xml:space="preserve">    rows = []</w:t>
+              <w:br/>
+              <w:t xml:space="preserve">    for expert, s in sorted(sums.items(), key=lambda x: int(x[0])):</w:t>
+              <w:br/>
+              <w:t xml:space="preserve">        is_best = (s == best)</w:t>
+              <w:br/>
+              <w:t xml:space="preserve">        marker = "★ МЕДИАНА" if is_best else ""</w:t>
+              <w:br/>
+              <w:t xml:space="preserve">        rows.append([f"Эксперт Э{expert}", s, marker])</w:t>
+              <w:br/>
+              <w:br/>
+              <w:t xml:space="preserve">    print(format_box_table(["Эксперт", "Сумма по строке S_k", "Статус"], rows, ["center", "right", "center"]))</w:t>
+              <w:br/>
+              <w:br/>
+              <w:t xml:space="preserve">    print(f"\nМинимальное суммарное расстояние Кемени: S_min = {best}")</w:t>
+              <w:br/>
+              <w:t xml:space="preserve">    print("Медианное(-ые) экспертное(-ые) ранжирование(-я):")</w:t>
+              <w:br/>
+              <w:t xml:space="preserve">    for m in medians:</w:t>
+              <w:br/>
+              <w:t xml:space="preserve">        ranks = transformed[int(m)]</w:t>
+              <w:br/>
+              <w:t xml:space="preserve">        order = [obj for obj, _ in sorted(ranks.items(), key=lambda x: x[1])]</w:t>
+              <w:br/>
+              <w:t xml:space="preserve">        print(f"  • Эксперт Э{m}: {' ≻ '.join(order)}  (S = {best})")</w:t>
+              <w:br/>
+              <w:t xml:space="preserve">    print_note("Данное ранжирование выбрано исключительно из числа предложенных экспертами суждений.")</w:t>
+              <w:br/>
+              <w:br/>
+              <w:br/>
+              <w:t># =========================================================================</w:t>
+              <w:br/>
+              <w:t># 5. ЗАДАЧА О НАЗНАЧЕНИЯХ И ПОЛНЫЙ ПЕРЕБОР</w:t>
+              <w:br/>
+              <w:t># =========================================================================</w:t>
+              <w:br/>
+              <w:br/>
+              <w:t>def print_kemeny_assignment(orders: List[List[str]], total: int, loss: NamedMatrix) -&gt; None:</w:t>
+              <w:br/>
+              <w:t xml:space="preserve">    """Вывод решения задачи о назначениях."""</w:t>
+              <w:br/>
+              <w:t xml:space="preserve">    print_header("6. ЗАДАЧА О НАЗНАЧЕНИЯХ (ПОЗИЦИОННАЯ МАТРИЦА ПОТЕРЬ)", "Минимизация суммы позиционных потерь Φ_Assign(X) = ∑ r_ij · X_ij")</w:t>
+              <w:br/>
+              <w:t xml:space="preserve">    print("\nМатрица позиционных потерь r_ij (строки — объекты, столбцы — места 1..n):")</w:t>
+              <w:br/>
+              <w:t xml:space="preserve">    cols = loss.cols</w:t>
+              <w:br/>
+              <w:t xml:space="preserve">    rows = [[r] + [loss[r, c] for c in cols] for r in loss.rows]</w:t>
+              <w:br/>
+              <w:t xml:space="preserve">    headers = ["Объект"] + [f"Место {c}" for c in cols]</w:t>
+              <w:br/>
+              <w:t xml:space="preserve">    print(format_box_table(headers, rows, ["center"] * len(headers)))</w:t>
+              <w:br/>
+              <w:br/>
+              <w:t xml:space="preserve">    print(f"\n✓ Минимальная сумма позиционных потерь: Φ_Assign = {total}")</w:t>
+              <w:br/>
+              <w:t xml:space="preserve">    print(f"✓ Количество оптимальных решений: {len(orders)}")</w:t>
+              <w:br/>
+              <w:t xml:space="preserve">    print("\nОптимальные распределения альтернатив по местам:")</w:t>
+              <w:br/>
+              <w:t xml:space="preserve">    for i, order in enumerate(orders, start=1):</w:t>
+              <w:br/>
+              <w:t xml:space="preserve">        print(f"  {i}. {' ≻ '.join(order)}   (минимальные потери Φ_Assign = {total})")</w:t>
+              <w:br/>
+              <w:br/>
+              <w:t xml:space="preserve">    print_note(</w:t>
+              <w:br/>
+              <w:t xml:space="preserve">        f"Значение {total} относится к позиционной L1-функции штрафа задачи о назначениях. "</w:t>
+              <w:br/>
+              <w:t xml:space="preserve">        "Оно не является расстоянием Кемени и оптимизирует другой критерий!"</w:t>
+              <w:br/>
+              <w:t xml:space="preserve">    )</w:t>
+              <w:br/>
+              <w:br/>
+              <w:br/>
+              <w:t>def print_kemeny_bruteforce(orders: List[List[str]], total: int, num_checked: int = 120) -&gt; None:</w:t>
+              <w:br/>
+              <w:t xml:space="preserve">    """Вывод результатов полного перебора Кемени."""</w:t>
+              <w:br/>
+              <w:t xml:space="preserve">    print_header(</w:t>
+              <w:br/>
+              <w:t xml:space="preserve">        "7. ИСТИННАЯ МЕДИАНА КЕМЕНИ (ПОЛНЫЙ ПЕРЕБОР ПЕРЕСТАНОВОК)",</w:t>
+              <w:br/>
+              <w:t xml:space="preserve">        f"Глобальная минимизация истинного расстояния Кемени Φ_Kemeny(R) = ∑ d(R, R_k) на всех {num_checked} перестановках"</w:t>
+              <w:br/>
+              <w:t xml:space="preserve">    )</w:t>
+              <w:br/>
+              <w:t xml:space="preserve">    print(f"✓ Проверено всех строгих перестановок: {num_checked}")</w:t>
+              <w:br/>
+              <w:t xml:space="preserve">    print(f"✓ Минимальная сумма попарных расстояний Кемени: Φ_Kemeny = {total}")</w:t>
+              <w:br/>
+              <w:t xml:space="preserve">    print(f"✓ Найдено глобальных оптимумов Кемени: {len(orders)}")</w:t>
+              <w:br/>
+              <w:t xml:space="preserve">    print("\nГлобальные медианы Кемени:")</w:t>
+              <w:br/>
+              <w:t xml:space="preserve">    for i, order in enumerate(orders, start=1):</w:t>
+              <w:br/>
+              <w:t xml:space="preserve">        print(f"  {i}. {' ≻ '.join(order)}   (истинное расстояние Кемени Σ d = {total})")</w:t>
+              <w:br/>
+              <w:br/>
+              <w:t xml:space="preserve">    print_note("Истинная медиана Кемени строго минимизирует сумму попарных инверсий ко всем экспертам комиссии без приближений.")</w:t>
+              <w:br/>
+              <w:br/>
+              <w:br/>
+              <w:t># =========================================================================</w:t>
+              <w:br/>
+              <w:t># 6. СВОДНОЕ СОПОСТАВЛЕНИЕ И ИТОГОВАЯ ИНТЕРПРЕТАЦИЯ</w:t>
+              <w:br/>
+              <w:t># =========================================================================</w:t>
+              <w:br/>
+              <w:br/>
+              <w:t>def print_kemeny_comparison(</w:t>
+              <w:br/>
+              <w:t xml:space="preserve">    relations: Dict[int, "NamedMatrix"],</w:t>
+              <w:br/>
+              <w:t xml:space="preserve">    objects: List[str],</w:t>
+              <w:br/>
+              <w:t xml:space="preserve">    transformed: Dict[int, Dict[str, int]],</w:t>
+              <w:br/>
+              <w:t xml:space="preserve">    distances: "NamedMatrix",</w:t>
+              <w:br/>
+              <w:t xml:space="preserve">    medians_experts: List[str],</w:t>
+              <w:br/>
+              <w:t xml:space="preserve">    assignment_orders: List[List[str]],</w:t>
+              <w:br/>
+              <w:t xml:space="preserve">    assignment_total: int,</w:t>
+              <w:br/>
+              <w:t xml:space="preserve">    bruteforce_orders: List[List[str]],</w:t>
+              <w:br/>
+              <w:t xml:space="preserve">    bruteforce_total: int,</w:t>
+              <w:br/>
+              <w:t>) -&gt; None:</w:t>
+              <w:br/>
+              <w:t xml:space="preserve">    """Сравнительный анализ подходов к определению коллективного предпочтения."""</w:t>
+              <w:br/>
+              <w:t xml:space="preserve">    from .kemeny import kemeny_total_distance</w:t>
+              <w:br/>
+              <w:br/>
+              <w:t xml:space="preserve">    print_header("8. СВОДНОЕ СОПОСТАВЛЕНИЕ РЕЗУЛЬТАТОВ ВСЕХ МЕТОДОВ", "Сопоставление целевых функций и полученных ранжирований")</w:t>
+              <w:br/>
+              <w:br/>
+              <w:t xml:space="preserve">    comp_rows = []</w:t>
+              <w:br/>
+              <w:br/>
+              <w:t xml:space="preserve">    # 1. Экспертные медианы</w:t>
+              <w:br/>
+              <w:t xml:space="preserve">    sums = {row: sum(distances[row].values()) for row in distances.rows}</w:t>
+              <w:br/>
+              <w:t xml:space="preserve">    for m in medians_experts:</w:t>
+              <w:br/>
+              <w:t xml:space="preserve">        ranks = transformed[int(m)]</w:t>
+              <w:br/>
+              <w:t xml:space="preserve">        order = [obj for obj, _ in sorted(ranks.items(), key=lambda x: x[1])]</w:t>
+              <w:br/>
+              <w:t xml:space="preserve">        d_kemeny = kemeny_total_distance(order, relations, objects)</w:t>
+              <w:br/>
+              <w:t xml:space="preserve">        comp_rows.append([</w:t>
+              <w:br/>
+              <w:t xml:space="preserve">            f"Медиана среди экспертов (Э{m})",</w:t>
+              <w:br/>
+              <w:t xml:space="preserve">            "Сумма по строке D",</w:t>
+              <w:br/>
+              <w:t xml:space="preserve">            f"S = {sums[m]}",</w:t>
+              <w:br/>
+              <w:t xml:space="preserve">            " ≻ ".join(order),</w:t>
+              <w:br/>
+              <w:t xml:space="preserve">            f"Σ d = {d_kemeny}",</w:t>
+              <w:br/>
+              <w:t xml:space="preserve">        ])</w:t>
+              <w:br/>
+              <w:br/>
+              <w:t xml:space="preserve">    # 2. Задача о назначениях</w:t>
+              <w:br/>
+              <w:t xml:space="preserve">    for i, order in enumerate(assignment_orders, start=1):</w:t>
+              <w:br/>
+              <w:t xml:space="preserve">        d_kemeny = kemeny_total_distance(order, relations, objects)</w:t>
+              <w:br/>
+              <w:t xml:space="preserve">        lbl = f"Задача назначений (решение {i})" if len(assignment_orders) &gt; 1 else "Задача назначений"</w:t>
+              <w:br/>
+              <w:t xml:space="preserve">        comp_rows.append([</w:t>
+              <w:br/>
+              <w:t xml:space="preserve">            lbl,</w:t>
+              <w:br/>
+              <w:t xml:space="preserve">            "Сумма потерь r_ij",</w:t>
+              <w:br/>
+              <w:t xml:space="preserve">            f"Φ_Assign = {assignment_total}",</w:t>
+              <w:br/>
+              <w:t xml:space="preserve">            " ≻ ".join(order),</w:t>
+              <w:br/>
+              <w:t xml:space="preserve">            f"Σ d = {d_kemeny}",</w:t>
+              <w:br/>
+              <w:t xml:space="preserve">        ])</w:t>
+              <w:br/>
+              <w:br/>
+              <w:t xml:space="preserve">    # 3. Полный перебор Кемени</w:t>
+              <w:br/>
+              <w:t xml:space="preserve">    for i, order in enumerate(bruteforce_orders, start=1):</w:t>
+              <w:br/>
+              <w:t xml:space="preserve">        lbl = f"Истинная медиана (оптимум {i})" if len(bruteforce_orders) &gt; 1 else "Истинная медиана Кемени"</w:t>
+              <w:br/>
+              <w:t xml:space="preserve">        comp_rows.append([</w:t>
+              <w:br/>
+              <w:t xml:space="preserve">            lbl,</w:t>
+              <w:br/>
+              <w:t xml:space="preserve">            "Сумма расстояний Кемени",</w:t>
+              <w:br/>
+              <w:t xml:space="preserve">            f"Φ_Kemeny = {bruteforce_total}",</w:t>
+              <w:br/>
+              <w:t xml:space="preserve">            " ≻ ".join(order),</w:t>
+              <w:br/>
+              <w:t xml:space="preserve">            f"Σ d = {bruteforce_total}",</w:t>
+              <w:br/>
+              <w:t xml:space="preserve">        ])</w:t>
+              <w:br/>
+              <w:br/>
+              <w:t xml:space="preserve">    headers = ["Метод агрегирования", "Оптимизируемый критерий", "Экстремум", "Результирующий порядок", "Расстояние Кемени"]</w:t>
+              <w:br/>
+              <w:t xml:space="preserve">    print(format_box_table(headers, comp_rows, ["left", "left", "center", "left", "center"]))</w:t>
+              <w:br/>
+              <w:br/>
+              <w:t xml:space="preserve">    print_note(</w:t>
+              <w:br/>
+              <w:t xml:space="preserve">        f"Обратите внимание: минимум задачи назначений ({assignment_total}) и минимум Кемени ({bruteforce_total}) — "</w:t>
+              <w:br/>
+              <w:t xml:space="preserve">        "это значения РАЗНЫХ целевых функций. Их прямое сравнение математически некорректно."</w:t>
+              <w:br/>
+              <w:t xml:space="preserve">    )</w:t>
+              <w:br/>
+              <w:br/>
+              <w:br/>
+              <w:t>def print_analytical_interpretation(</w:t>
+              <w:br/>
+              <w:t xml:space="preserve">    table: Dict[int, Dict[str, int]],</w:t>
+              <w:br/>
+              <w:t xml:space="preserve">    objects: List[str],</w:t>
+              <w:br/>
+              <w:t xml:space="preserve">    relations: Dict[int, NamedMatrix],</w:t>
+              <w:br/>
+              <w:t xml:space="preserve">    assignment_orders: List[List[str]],</w:t>
+              <w:br/>
+              <w:t xml:space="preserve">    assignment_total: int,</w:t>
+              <w:br/>
+              <w:t xml:space="preserve">    bruteforce_orders: List[List[str]],</w:t>
+              <w:br/>
+              <w:t xml:space="preserve">    bruteforce_total: int,</w:t>
+              <w:br/>
+              <w:t>) -&gt; None:</w:t>
+              <w:br/>
+              <w:t xml:space="preserve">    """Формирует и выводит итоговую динамическую интерпретацию группового выбора."""</w:t>
+              <w:br/>
+              <w:t xml:space="preserve">    from .kemeny import kemeny_total_distance</w:t>
+              <w:br/>
+              <w:t xml:space="preserve">    from .stats import get_ranking_by_average, get_ranking_by_median</w:t>
+              <w:br/>
+              <w:br/>
+              <w:t xml:space="preserve">    avg_ranking = get_ranking_by_average(table)</w:t>
+              <w:br/>
+              <w:t xml:space="preserve">    med_ranking = get_ranking_by_median(table)</w:t>
+              <w:br/>
+              <w:br/>
+              <w:t xml:space="preserve">    print_header("9. ИТОГОВАЯ АНАЛИТИЧЕСКАЯ ИНТЕРПРЕТАЦИЯ РЕЗУЛЬТАТОВ", "Синтез коллективного решения на основе всех исследованных методов")</w:t>
+              <w:br/>
+              <w:br/>
+              <w:t xml:space="preserve">    # 1. Анализ лидеров и аутсайдеров по Кемени</w:t>
+              <w:br/>
+              <w:t xml:space="preserve">    first_places = [order[0] for order in bruteforce_orders]</w:t>
+              <w:br/>
+              <w:t xml:space="preserve">    last_places = [order[-1] for order in bruteforce_orders]</w:t>
+              <w:br/>
+              <w:br/>
+              <w:t xml:space="preserve">    top_objs = sorted(list(set(first_places)))</w:t>
+              <w:br/>
+              <w:t xml:space="preserve">    bottom_objs = sorted(list(set(last_places)))</w:t>
+              <w:br/>
+              <w:br/>
+              <w:t xml:space="preserve">    print("\n1. СТРУКТУРА КОЛЛЕКТИВНОГО ПРИОРИТЕТА:")</w:t>
+              <w:br/>
+              <w:t xml:space="preserve">    if len(top_objs) == 1:</w:t>
+              <w:br/>
+              <w:t xml:space="preserve">        print(f"   • Абсолютным фаворитом по критерию Кемени признана альтернатива: {top_objs[0]}.")</w:t>
               <w:br/>
               <w:t xml:space="preserve">    else:</w:t>
               <w:br/>
-              <w:t xml:space="preserve">        labels = ", ".join(f"Э{m}" for m in medians)</w:t>
-              <w:br/>
-              <w:t xml:space="preserve">        print(f"\nМедианы Кемени (среди экспертов, ничья): {labels}")</w:t>
-              <w:br/>
-              <w:br/>
-              <w:t xml:space="preserve">    print(f"Суммарное расстояние: {best}")</w:t>
-              <w:br/>
-              <w:br/>
-              <w:t xml:space="preserve">    print("\nРанжирования медиан:")</w:t>
-              <w:br/>
-              <w:t xml:space="preserve">    for m in medians:</w:t>
-              <w:br/>
-              <w:t xml:space="preserve">        ranks = transformed[int(m)]</w:t>
-              <w:br/>
-              <w:t xml:space="preserve">        order = [obj for obj, _ in sorted(ranks.items(), key=lambda x: x[1])]</w:t>
-              <w:br/>
-              <w:t xml:space="preserve">        print(f"  Э{m}: {' &gt; '.join(order)}")</w:t>
-              <w:br/>
-              <w:br/>
-              <w:t>def print_kemeny_assignment(orders: List[List[str]], total: int, loss: NamedMatrix) -&gt; None:</w:t>
-              <w:br/>
-              <w:t xml:space="preserve">    print("\n=== Задача о назначениях ===")</w:t>
-              <w:br/>
-              <w:br/>
-              <w:t xml:space="preserve">    print("\nМатрица потерь r_ij:")</w:t>
-              <w:br/>
-              <w:t xml:space="preserve">    print(loss)</w:t>
-              <w:br/>
-              <w:br/>
-              <w:t xml:space="preserve">    print(f"\nМинимальное значение целевой функции: {total}")</w:t>
-              <w:br/>
-              <w:t xml:space="preserve">    print(f"Количество оптимальных назначений: {len(orders)}")</w:t>
-              <w:br/>
-              <w:br/>
-              <w:t xml:space="preserve">    print("\nВсе оптимальные ранжирования:")</w:t>
-              <w:br/>
-              <w:t xml:space="preserve">    for i, order in enumerate(orders, start=1):</w:t>
-              <w:br/>
-              <w:t xml:space="preserve">        print(f"  {i}. {' &gt; '.join(order)}   (Σ r_ij = {total})")</w:t>
-              <w:br/>
-              <w:br/>
-              <w:t>def print_kemeny_comparison(</w:t>
-              <w:br/>
-              <w:t xml:space="preserve">    relations: Dict[int, "NamedMatrix"],</w:t>
-              <w:br/>
-              <w:t xml:space="preserve">    objects: List[str],</w:t>
-              <w:br/>
-              <w:t xml:space="preserve">    transformed: Dict[int, Dict[str, int]],</w:t>
-              <w:br/>
-              <w:t xml:space="preserve">    distances: "NamedMatrix",</w:t>
-              <w:br/>
-              <w:t xml:space="preserve">    medians_experts: List[str],</w:t>
-              <w:br/>
-              <w:t xml:space="preserve">    assignment_orders: List[List[str]],</w:t>
-              <w:br/>
-              <w:t xml:space="preserve">    assignment_total: int,</w:t>
-              <w:br/>
-              <w:t xml:space="preserve">    bruteforce_orders: List[List[str]],</w:t>
-              <w:br/>
-              <w:t xml:space="preserve">    bruteforce_total: int,</w:t>
-              <w:br/>
-              <w:t>) -&gt; None:</w:t>
-              <w:br/>
-              <w:t xml:space="preserve">    """</w:t>
-              <w:br/>
-              <w:t xml:space="preserve">    Сравнивает результаты:</w:t>
-              <w:br/>
-              <w:t xml:space="preserve">    1. медианы среди экспертных ранжирований;</w:t>
-              <w:br/>
-              <w:t xml:space="preserve">    2. все оптимумы задачи о назначениях;</w:t>
-              <w:br/>
-              <w:t xml:space="preserve">    3. все оптимумы истинного Кемени полным перебором.</w:t>
-              <w:br/>
-              <w:t xml:space="preserve">    """</w:t>
-              <w:br/>
-              <w:t xml:space="preserve">    from .kemeny import kemeny_total_distance</w:t>
-              <w:br/>
-              <w:br/>
-              <w:t xml:space="preserve">    print("\n" + "=" * 60)</w:t>
-              <w:br/>
-              <w:t xml:space="preserve">    print("Сравнение подходов к медиане Кемени")</w:t>
-              <w:br/>
-              <w:t xml:space="preserve">    print("=" * 60)</w:t>
-              <w:br/>
-              <w:br/>
-              <w:t xml:space="preserve">    # --- 1. Среди экспертов ---</w:t>
-              <w:br/>
-              <w:t xml:space="preserve">    print("\n1. Медианы среди экспертов:")</w:t>
-              <w:br/>
-              <w:br/>
-              <w:t xml:space="preserve">    sums = {</w:t>
-              <w:br/>
-              <w:t xml:space="preserve">        row: sum(distances[row].values())</w:t>
-              <w:br/>
-              <w:t xml:space="preserve">        for row in distances.rows</w:t>
-              <w:br/>
-              <w:t xml:space="preserve">    }</w:t>
-              <w:br/>
-              <w:br/>
-              <w:t xml:space="preserve">    for m in medians_experts:</w:t>
-              <w:br/>
-              <w:t xml:space="preserve">        ranks = transformed[int(m)]</w:t>
-              <w:br/>
-              <w:t xml:space="preserve">        order = [</w:t>
-              <w:br/>
-              <w:t xml:space="preserve">            obj</w:t>
-              <w:br/>
-              <w:t xml:space="preserve">            for obj, _ in sorted(</w:t>
-              <w:br/>
-              <w:t xml:space="preserve">                ranks.items(),</w:t>
-              <w:br/>
-              <w:t xml:space="preserve">                key=lambda x: x[1]</w:t>
-              <w:br/>
-              <w:t xml:space="preserve">            )</w:t>
-              <w:br/>
-              <w:t xml:space="preserve">        ]</w:t>
-              <w:br/>
-              <w:br/>
-              <w:t xml:space="preserve">        d_total = kemeny_total_distance(</w:t>
-              <w:br/>
-              <w:t xml:space="preserve">            order,</w:t>
-              <w:br/>
-              <w:t xml:space="preserve">            relations,</w:t>
-              <w:br/>
-              <w:t xml:space="preserve">            objects,</w:t>
-              <w:br/>
-              <w:t xml:space="preserve">        )</w:t>
-              <w:br/>
-              <w:br/>
-              <w:t xml:space="preserve">        print(f"   Э{m}: {' &gt; '.join(order)}")</w:t>
-              <w:br/>
-              <w:t xml:space="preserve">        print(</w:t>
-              <w:br/>
-              <w:t xml:space="preserve">            f"        Σ_k d(R, R_k) = {d_total} "</w:t>
-              <w:br/>
-              <w:t xml:space="preserve">            f"  (S по D = {sums[m]})"</w:t>
-              <w:br/>
-              <w:t xml:space="preserve">        )</w:t>
-              <w:br/>
-              <w:br/>
-              <w:t xml:space="preserve">    # --- 2. Задача о назначениях ---</w:t>
-              <w:br/>
-              <w:t xml:space="preserve">    print("\n2. Задача о назначениях:")</w:t>
-              <w:br/>
-              <w:t xml:space="preserve">    print(f"   Минимальное значение Σ r_ij = {assignment_total}")</w:t>
-              <w:br/>
-              <w:t xml:space="preserve">    print(</w:t>
-              <w:br/>
-              <w:t xml:space="preserve">        f"   Количество оптимальных решений: "</w:t>
-              <w:br/>
-              <w:t xml:space="preserve">        f"{len(assignment_orders)}"</w:t>
-              <w:br/>
-              <w:t xml:space="preserve">    )</w:t>
-              <w:br/>
-              <w:br/>
-              <w:t xml:space="preserve">    for i, order in enumerate(assignment_orders, start=1):</w:t>
-              <w:br/>
-              <w:t xml:space="preserve">        d_total = kemeny_total_distance(</w:t>
-              <w:br/>
-              <w:t xml:space="preserve">            order,</w:t>
-              <w:br/>
-              <w:t xml:space="preserve">            relations,</w:t>
-              <w:br/>
-              <w:t xml:space="preserve">            objects,</w:t>
-              <w:br/>
-              <w:t xml:space="preserve">        )</w:t>
-              <w:br/>
-              <w:br/>
-              <w:t xml:space="preserve">        print(f"   {i}. {' &gt; '.join(order)}")</w:t>
-              <w:br/>
-              <w:t xml:space="preserve">        print(f"      Σ r_ij         = {assignment_total}")</w:t>
-              <w:br/>
-              <w:t xml:space="preserve">        print(f"      Σ_k d(R, R_k)  = {d_total}")</w:t>
-              <w:br/>
-              <w:br/>
-              <w:t xml:space="preserve">    # --- 3. Полный перебор ---</w:t>
-              <w:br/>
-              <w:t xml:space="preserve">    print(</w:t>
-              <w:br/>
-              <w:t xml:space="preserve">        f"\n3. Полный перебор "</w:t>
-              <w:br/>
-              <w:t xml:space="preserve">        f"(все оптимумы, Σ = {bruteforce_total}):"</w:t>
-              <w:br/>
-              <w:t xml:space="preserve">    )</w:t>
-              <w:br/>
-              <w:br/>
-              <w:t xml:space="preserve">    print(</w:t>
-              <w:br/>
-              <w:t xml:space="preserve">        f"   Количество оптимальных решений: "</w:t>
-              <w:br/>
-              <w:t xml:space="preserve">        f"{len(bruteforce_orders)}"</w:t>
-              <w:br/>
-              <w:t xml:space="preserve">    )</w:t>
-              <w:br/>
-              <w:br/>
-              <w:t xml:space="preserve">    for i, order in enumerate(bruteforce_orders, start=1):</w:t>
-              <w:br/>
-              <w:t xml:space="preserve">        d_total = kemeny_total_distance(</w:t>
-              <w:br/>
-              <w:t xml:space="preserve">            order,</w:t>
-              <w:br/>
-              <w:t xml:space="preserve">            relations,</w:t>
-              <w:br/>
-              <w:t xml:space="preserve">            objects,</w:t>
-              <w:br/>
-              <w:t xml:space="preserve">        )</w:t>
-              <w:br/>
-              <w:br/>
-              <w:t xml:space="preserve">        print(</w:t>
-              <w:br/>
-              <w:t xml:space="preserve">            f"   {i}. {' &gt; '.join(order)} "</w:t>
-              <w:br/>
-              <w:t xml:space="preserve">            f"(Σ_k d = {d_total})"</w:t>
-              <w:br/>
-              <w:t xml:space="preserve">        )</w:t>
-              <w:br/>
-              <w:br/>
-              <w:t xml:space="preserve">    # --- Пересечения ---</w:t>
-              <w:br/>
-              <w:t xml:space="preserve">    print("\n" + "-" * 60)</w:t>
-              <w:br/>
-              <w:t xml:space="preserve">    print("Пересечение множеств оптимумов:")</w:t>
-              <w:br/>
-              <w:br/>
-              <w:t xml:space="preserve">    set_experts = {</w:t>
-              <w:br/>
-              <w:t xml:space="preserve">        tuple(</w:t>
-              <w:br/>
-              <w:t xml:space="preserve">            obj</w:t>
-              <w:br/>
-              <w:t xml:space="preserve">            for obj, _ in sorted(</w:t>
-              <w:br/>
-              <w:t xml:space="preserve">                transformed[int(m)].items(),</w:t>
-              <w:br/>
-              <w:t xml:space="preserve">                key=lambda x: x[1],</w:t>
-              <w:br/>
-              <w:t xml:space="preserve">            )</w:t>
-              <w:br/>
-              <w:t xml:space="preserve">        )</w:t>
-              <w:br/>
-              <w:t xml:space="preserve">        for m in medians_experts</w:t>
-              <w:br/>
-              <w:t xml:space="preserve">    }</w:t>
-              <w:br/>
-              <w:br/>
-              <w:t xml:space="preserve">    set_assignment = {</w:t>
-              <w:br/>
-              <w:t xml:space="preserve">        tuple(order)</w:t>
-              <w:br/>
-              <w:t xml:space="preserve">        for order in assignment_orders</w:t>
-              <w:br/>
-              <w:t xml:space="preserve">    }</w:t>
-              <w:br/>
-              <w:br/>
-              <w:t xml:space="preserve">    set_bruteforce = {</w:t>
-              <w:br/>
-              <w:t xml:space="preserve">        tuple(order)</w:t>
-              <w:br/>
-              <w:t xml:space="preserve">        for order in bruteforce_orders</w:t>
-              <w:br/>
-              <w:t xml:space="preserve">    }</w:t>
-              <w:br/>
-              <w:br/>
-              <w:t xml:space="preserve">    print(</w:t>
-              <w:br/>
-              <w:t xml:space="preserve">        f"   среди экспертов ∩ полный перебор: "</w:t>
-              <w:br/>
-              <w:t xml:space="preserve">        f"{len(set_experts &amp; set_bruteforce)}"</w:t>
-              <w:br/>
-              <w:t xml:space="preserve">    )</w:t>
-              <w:br/>
-              <w:br/>
-              <w:t xml:space="preserve">    print(</w:t>
-              <w:br/>
-              <w:t xml:space="preserve">        f"   назначения ∩ полный перебор:       "</w:t>
-              <w:br/>
-              <w:t xml:space="preserve">        f"{len(set_assignment &amp; set_bruteforce)}"</w:t>
-              <w:br/>
-              <w:t xml:space="preserve">    )</w:t>
-              <w:br/>
-              <w:br/>
-              <w:t xml:space="preserve">    print(</w:t>
-              <w:br/>
-              <w:t xml:space="preserve">        f"   назначения ∈ полный перебор:       "</w:t>
-              <w:br/>
-              <w:t xml:space="preserve">        f"{set_assignment &lt;= set_bruteforce}"</w:t>
-              <w:br/>
-              <w:t xml:space="preserve">    )</w:t>
+              <w:t xml:space="preserve">        print(f"   • В группу ключевых претендентов на лидерство входят: {', '.join(top_objs)}.")</w:t>
+              <w:br/>
+              <w:br/>
+              <w:t xml:space="preserve">    if len(bottom_objs) == 1:</w:t>
+              <w:br/>
+              <w:t xml:space="preserve">        print(f"   • Наименее предпочтительной (замыкающей) альтернативой признана: {bottom_objs[0]}.")</w:t>
+              <w:br/>
+              <w:t xml:space="preserve">    else:</w:t>
+              <w:br/>
+              <w:t xml:space="preserve">        print(f"   • Замыкающие позиции делят альтернативы: {', '.join(bottom_objs)}.")</w:t>
+              <w:br/>
+              <w:br/>
+              <w:t xml:space="preserve">    print(f"   • Лидер по средним арифметическим рангам: {avg_ranking[0][1]} (средний ранг {avg_ranking[0][2]:.2f}).")</w:t>
+              <w:br/>
+              <w:t xml:space="preserve">    print(f"   • Лидер по медианным рангам: {med_ranking[0][1]} (медианный ранг {med_ranking[0][2]:.2f}).")</w:t>
+              <w:br/>
+              <w:br/>
+              <w:t xml:space="preserve">    # 2. Сопоставление задачи о назначениях и медианы Кемени</w:t>
+              <w:br/>
+              <w:t xml:space="preserve">    print("\n2. СООТНОШЕНИЕ ЗАДАЧИ О НАЗНАЧЕНИЯХ И МЕДИАНЫ КЕМЕНИ:")</w:t>
+              <w:br/>
+              <w:t xml:space="preserve">    assign_set = {tuple(o) for o in assignment_orders}</w:t>
+              <w:br/>
+              <w:t xml:space="preserve">    kemeny_set = {tuple(o) for o in bruteforce_orders}</w:t>
+              <w:br/>
+              <w:t xml:space="preserve">    common = assign_set.intersection(kemeny_set)</w:t>
+              <w:br/>
+              <w:br/>
+              <w:t xml:space="preserve">    if common:</w:t>
+              <w:br/>
+              <w:t xml:space="preserve">        print(f"   • Решение задачи о назначениях строго совпало с истинной медианой Кемени.")</w:t>
+              <w:br/>
+              <w:t xml:space="preserve">        print(f"   • Значение функции позиционных потерь: {assignment_total}, истинное расстояние Кемени: {bruteforce_total}.")</w:t>
+              <w:br/>
+              <w:t xml:space="preserve">    else:</w:t>
+              <w:br/>
+              <w:t xml:space="preserve">        first_as = assignment_orders[0]</w:t>
+              <w:br/>
+              <w:t xml:space="preserve">        first_km = bruteforce_orders[0]</w:t>
+              <w:br/>
+              <w:t xml:space="preserve">        d_as = kemeny_total_distance(first_as, relations, objects)</w:t>
+              <w:br/>
+              <w:t xml:space="preserve">        print(f"   • Решение задачи о назначениях ({' ≻ '.join(first_as)})")</w:t>
+              <w:br/>
+              <w:t xml:space="preserve">        print(f"     НЕ совпадает с истинной глобальной медианой Кемени ({' ≻ '.join(first_km)}).")</w:t>
+              <w:br/>
+              <w:t xml:space="preserve">        print(f"   • По критерию задачи о назначениях минимум потерь составил: {assignment_total}.")</w:t>
+              <w:br/>
+              <w:t xml:space="preserve">        print(f"     При этом истинное расстояние Кемени для порядка задачи назначений равно {d_as},")</w:t>
+              <w:br/>
+              <w:t xml:space="preserve">        print(f"     что строго превышает глобальный оптимум Кемени ({bruteforce_total}).")</w:t>
+              <w:br/>
+              <w:t xml:space="preserve">        print("   • ВЫВОД: Оптимизация задачи о назначениях с позиционной матрицей потерь")</w:t>
+              <w:br/>
+              <w:t xml:space="preserve">        print("     сглаживает парные циклические доминирования и не гарантирует нахождения медианы Кемени.")</w:t>
+              <w:br/>
+              <w:br/>
+              <w:t xml:space="preserve">    # 3. Множественность оптимумов</w:t>
+              <w:br/>
+              <w:t xml:space="preserve">    print("\n3. УСТОЙЧИВОСТЬ ГЛОБАЛЬНОГО ВЫБОРА:")</w:t>
+              <w:br/>
+              <w:t xml:space="preserve">    if len(bruteforce_orders) == 1:</w:t>
+              <w:br/>
+              <w:t xml:space="preserve">        print(f"   • Найдено ЕДИНСТВЕННОЕ глобальное медианное ранжирование со значением Кемени {bruteforce_total}:")</w:t>
+              <w:br/>
+              <w:t xml:space="preserve">        print(f"     {' ≻ '.join(bruteforce_orders[0])}")</w:t>
+              <w:br/>
+              <w:t xml:space="preserve">        print("   • Коллективное предпочтение экспертной комиссии определено однозначно.")</w:t>
+              <w:br/>
+              <w:t xml:space="preserve">    else:</w:t>
+              <w:br/>
+              <w:t xml:space="preserve">        print(f"   • Найдено {len(bruteforce_orders)} РАВНОПРАВНЫХ глобальных оптимумов Кемени со значением {bruteforce_total}.")</w:t>
+              <w:br/>
+              <w:t xml:space="preserve">        print("   • Это свидетельствует о наличии паритета между несколькими перестановками внутри группы.")</w:t>
               <w:br/>
             </w:r>
           </w:p>
@@ -12391,10 +12584,30 @@
                 <w:color w:val="1E293B"/>
                 <w:sz w:val="16"/>
               </w:rPr>
+              <w:t># -*- coding: utf-8 -*-</w:t>
+              <w:br/>
+              <w:t>"""</w:t>
+              <w:br/>
+              <w:t>Главный модуль консольного интерфейса (CLI) лабораторной работы №1:</w:t>
+              <w:br/>
+              <w:t>«Исследование сложных систем методом экспертных оценок».</w:t>
+              <w:br/>
+              <w:br/>
+              <w:t>Обеспечивает интерактивное академическое взаимодействие, пошаговое выполнение этапов,</w:t>
+              <w:br/>
+              <w:t>интерактивный ввод суждений с валидацией, детальные пояснения и аналитическую интерпретацию.</w:t>
+              <w:br/>
+              <w:t>"""</w:t>
+              <w:br/>
+              <w:br/>
               <w:t>import sys</w:t>
               <w:br/>
-              <w:br/>
-              <w:t>from .config import DEFAULT_INPUT, STAGES</w:t>
+              <w:t>from pathlib import Path</w:t>
+              <w:br/>
+              <w:t>from typing import Dict, List, Optional</w:t>
+              <w:br/>
+              <w:br/>
+              <w:t>from .config import DEFAULT_INPUT</w:t>
               <w:br/>
               <w:t>from .io import read_data</w:t>
               <w:br/>
@@ -12402,12 +12615,6 @@
               <w:br/>
               <w:t>from .stats import (</w:t>
               <w:br/>
-              <w:t xml:space="preserve">    get_ranks_sum,</w:t>
-              <w:br/>
-              <w:t xml:space="preserve">    get_ranks_average,</w:t>
-              <w:br/>
-              <w:t xml:space="preserve">    get_ranks_median,</w:t>
-              <w:br/>
               <w:t xml:space="preserve">    get_ranking_by_average,</w:t>
               <w:br/>
               <w:t xml:space="preserve">    get_ranking_by_median,</w:t>
@@ -12432,8 +12639,6 @@
               <w:br/>
               <w:t xml:space="preserve">    get_kemeny_medians_by_experts,</w:t>
               <w:br/>
-              <w:t xml:space="preserve">    get_kemeny_median_assignment,</w:t>
-              <w:br/>
               <w:t xml:space="preserve">    get_all_assignment_medians,</w:t>
               <w:br/>
               <w:t xml:space="preserve">    get_all_kemeny_medians_bruteforce,</w:t>
@@ -12446,7 +12651,9 @@
               <w:br/>
               <w:t xml:space="preserve">    print_transformed_data,</w:t>
               <w:br/>
-              <w:t xml:space="preserve">    print_ranking,</w:t>
+              <w:t xml:space="preserve">    print_ranking_by_average,</w:t>
+              <w:br/>
+              <w:t xml:space="preserve">    print_ranking_by_median,</w:t>
               <w:br/>
               <w:t xml:space="preserve">    print_preference_vectors,</w:t>
               <w:br/>
@@ -12460,56 +12667,53 @@
               <w:br/>
               <w:t xml:space="preserve">    print_kemeny_assignment,</w:t>
               <w:br/>
+              <w:t xml:space="preserve">    print_kemeny_bruteforce,</w:t>
+              <w:br/>
               <w:t xml:space="preserve">    print_kemeny_comparison,</w:t>
               <w:br/>
+              <w:t xml:space="preserve">    print_analytical_interpretation,</w:t>
+              <w:br/>
               <w:t>)</w:t>
               <w:br/>
               <w:br/>
-              <w:t># Названия этапов для меню</w:t>
-              <w:br/>
-              <w:t>STAGE_TITLES = {</w:t>
-              <w:br/>
-              <w:t xml:space="preserve">    "raw":               "Исходные данные",</w:t>
-              <w:br/>
-              <w:t xml:space="preserve">    "transformed":       "Матрица Эксперт × Объект",</w:t>
-              <w:br/>
-              <w:t xml:space="preserve">    "average":           "Ранжирование по среднему",</w:t>
-              <w:br/>
-              <w:t xml:space="preserve">    "median":            "Ранжирование по медиане",</w:t>
-              <w:br/>
-              <w:t xml:space="preserve">    "preferences":       "Векторы предпочтений π^(k)",</w:t>
-              <w:br/>
-              <w:t xml:space="preserve">    "relations":         "Матрицы бинарных отношений",</w:t>
-              <w:br/>
-              <w:t xml:space="preserve">    "distances":         "Матрица расстояний Кемени",</w:t>
-              <w:br/>
-              <w:t xml:space="preserve">    "diffs":             "Матрицы разностей |A − B|",</w:t>
-              <w:br/>
-              <w:t xml:space="preserve">    "kemeny_experts":    "Медиана Кемени (среди экспертов)",</w:t>
-              <w:br/>
-              <w:t xml:space="preserve">    "kemeny_assignment": "Медиана Кемени (задача о назначениях)",</w:t>
-              <w:br/>
-              <w:t xml:space="preserve">    "kemeny_bruteforce": "Медиана Кемени (полный перебор)",</w:t>
-              <w:br/>
-              <w:t xml:space="preserve">    "kemeny_compare":    "Сравнение подходов к медиане",</w:t>
-              <w:br/>
-              <w:t>}</w:t>
-              <w:br/>
               <w:br/>
               <w:t>class Context:</w:t>
               <w:br/>
-              <w:t xml:space="preserve">    """Хранит промежуточные результаты, чтобы не считать их дважды."""</w:t>
-              <w:br/>
-              <w:br/>
-              <w:t xml:space="preserve">    def __init__(self, filepath: str) -&gt; None:</w:t>
+              <w:t xml:space="preserve">    """Контекст сессии: хранит активные данные и кеширует промежуточные результаты."""</w:t>
+              <w:br/>
+              <w:br/>
+              <w:t xml:space="preserve">    def __init__(self, filepath: str = DEFAULT_INPUT) -&gt; None:</w:t>
+              <w:br/>
+              <w:t xml:space="preserve">        self.source_label = filepath</w:t>
               <w:br/>
               <w:t xml:space="preserve">        self.filepath = filepath</w:t>
               <w:br/>
-              <w:t xml:space="preserve">        self.raw = {}</w:t>
-              <w:br/>
-              <w:t xml:space="preserve">        self.transformed = {}</w:t>
-              <w:br/>
-              <w:t xml:space="preserve">        self.objects = []</w:t>
+              <w:t xml:space="preserve">        self.raw: Dict[int, List[str]] = {}</w:t>
+              <w:br/>
+              <w:t xml:space="preserve">        self.transformed: Dict[int, Dict[str, int]] = {}</w:t>
+              <w:br/>
+              <w:t xml:space="preserve">        self.objects: List[str] = []</w:t>
+              <w:br/>
+              <w:t xml:space="preserve">        self.preferences: Dict[int, Dict[str, int]] = {}</w:t>
+              <w:br/>
+              <w:t xml:space="preserve">        self.relations: Dict[int, object] = {}</w:t>
+              <w:br/>
+              <w:t xml:space="preserve">        self.distances = None</w:t>
+              <w:br/>
+              <w:t xml:space="preserve">        self.diffs = {}</w:t>
+              <w:br/>
+              <w:t xml:space="preserve">        self.sums: Dict[str, int] = {}</w:t>
+              <w:br/>
+              <w:t xml:space="preserve">        self.medians_experts: List[str] = []</w:t>
+              <w:br/>
+              <w:t xml:space="preserve">        self.assignment = None</w:t>
+              <w:br/>
+              <w:t xml:space="preserve">        self.bruteforce = None</w:t>
+              <w:br/>
+              <w:br/>
+              <w:t xml:space="preserve">    def reset_cache(self) -&gt; None:</w:t>
+              <w:br/>
+              <w:t xml:space="preserve">        """Сбрасывает кеш вычислений при изменении входных данных."""</w:t>
               <w:br/>
               <w:t xml:space="preserve">        self.preferences = {}</w:t>
               <w:br/>
@@ -12528,57 +12732,119 @@
               <w:t xml:space="preserve">        self.bruteforce = None</w:t>
               <w:br/>
               <w:br/>
-              <w:t xml:space="preserve">    def load(self) -&gt; None:</w:t>
-              <w:br/>
-              <w:t xml:space="preserve">        self.raw = read_data(self.filepath)</w:t>
+              <w:t xml:space="preserve">    def load(self, filepath: Optional[str] = None) -&gt; None:</w:t>
+              <w:br/>
+              <w:t xml:space="preserve">        """Загружает данные из файла."""</w:t>
+              <w:br/>
+              <w:t xml:space="preserve">        target_path = filepath or self.filepath</w:t>
+              <w:br/>
+              <w:t xml:space="preserve">        self.raw = read_data(target_path)</w:t>
+              <w:br/>
+              <w:t xml:space="preserve">        self.filepath = target_path</w:t>
+              <w:br/>
+              <w:t xml:space="preserve">        self.source_label = target_path</w:t>
               <w:br/>
               <w:t xml:space="preserve">        self.transformed = transform_data(self.raw)</w:t>
               <w:br/>
               <w:t xml:space="preserve">        self.objects = get_objects(self.transformed)</w:t>
               <w:br/>
-              <w:br/>
-              <w:t>def run_stage(stage: str, ctx: Context) -&gt; None:</w:t>
-              <w:br/>
-              <w:t xml:space="preserve">    """Выполняет один этап (с ленивым расчётом зависимостей)."""</w:t>
-              <w:br/>
-              <w:br/>
-              <w:t xml:space="preserve">    if stage == "raw":</w:t>
+              <w:t xml:space="preserve">        self.reset_cache()</w:t>
+              <w:br/>
+              <w:br/>
+              <w:t xml:space="preserve">    def set_data(self, raw_table: Dict[int, List[str]], label: str = "Ввод с клавиатуры") -&gt; None:</w:t>
+              <w:br/>
+              <w:t xml:space="preserve">        """Устанавливает данные, введённые пользователем вручную."""</w:t>
+              <w:br/>
+              <w:t xml:space="preserve">        self.raw = raw_table</w:t>
+              <w:br/>
+              <w:t xml:space="preserve">        self.source_label = label</w:t>
+              <w:br/>
+              <w:t xml:space="preserve">        self.transformed = transform_data(self.raw)</w:t>
+              <w:br/>
+              <w:t xml:space="preserve">        self.objects = get_objects(self.transformed)</w:t>
+              <w:br/>
+              <w:t xml:space="preserve">        self.reset_cache()</w:t>
+              <w:br/>
+              <w:br/>
+              <w:br/>
+              <w:t># =========================================================================</w:t>
+              <w:br/>
+              <w:t># ВЫПОЛНЕНИЕ ЭТАПОВ</w:t>
+              <w:br/>
+              <w:t># =========================================================================</w:t>
+              <w:br/>
+              <w:br/>
+              <w:t>def run_stage(code: str, ctx: Context) -&gt; None:</w:t>
+              <w:br/>
+              <w:t xml:space="preserve">    """Выполняет выбранный этап анализа с ленивым расчётом зависимостей."""</w:t>
+              <w:br/>
+              <w:br/>
+              <w:t xml:space="preserve">    if code == "1":</w:t>
+              <w:br/>
+              <w:t xml:space="preserve">        # Протоколы и матрица рангов</w:t>
               <w:br/>
               <w:t xml:space="preserve">        print_raw_data(ctx.raw)</w:t>
               <w:br/>
-              <w:br/>
-              <w:t xml:space="preserve">    elif stage == "transformed":</w:t>
-              <w:br/>
               <w:t xml:space="preserve">        print_transformed_data(ctx.transformed, ctx.objects)</w:t>
               <w:br/>
               <w:br/>
-              <w:t xml:space="preserve">    elif stage == "average":</w:t>
-              <w:br/>
-              <w:t xml:space="preserve">        print_ranking(</w:t>
-              <w:br/>
-              <w:t xml:space="preserve">            "Итоговое ранжирование по среднему",</w:t>
-              <w:br/>
-              <w:t xml:space="preserve">            get_ranking_by_average(ctx.transformed),</w:t>
-              <w:br/>
-              <w:t xml:space="preserve">            "средний ранг",</w:t>
+              <w:t xml:space="preserve">    elif code == "2":</w:t>
+              <w:br/>
+              <w:t xml:space="preserve">        # Средние ранги</w:t>
+              <w:br/>
+              <w:t xml:space="preserve">        print_ranking_by_average(</w:t>
+              <w:br/>
+              <w:t xml:space="preserve">            {obj: r for _, obj, r in get_ranking_by_average(ctx.transformed)}</w:t>
               <w:br/>
               <w:t xml:space="preserve">        )</w:t>
               <w:br/>
               <w:br/>
-              <w:t xml:space="preserve">    elif stage == "median":</w:t>
-              <w:br/>
-              <w:t xml:space="preserve">        print_ranking(</w:t>
-              <w:br/>
-              <w:t xml:space="preserve">            "Итоговое ранжирование по медиане",</w:t>
-              <w:br/>
-              <w:t xml:space="preserve">            get_ranking_by_median(ctx.transformed),</w:t>
-              <w:br/>
-              <w:t xml:space="preserve">            "медиана",</w:t>
+              <w:t xml:space="preserve">    elif code == "3":</w:t>
+              <w:br/>
+              <w:t xml:space="preserve">        # Медианные ранги</w:t>
+              <w:br/>
+              <w:t xml:space="preserve">        print_ranking_by_median(</w:t>
+              <w:br/>
+              <w:t xml:space="preserve">            {obj: r for _, obj, r in get_ranking_by_median(ctx.transformed)}</w:t>
               <w:br/>
               <w:t xml:space="preserve">        )</w:t>
               <w:br/>
               <w:br/>
-              <w:t xml:space="preserve">    elif stage == "preferences":</w:t>
+              <w:t xml:space="preserve">    elif code == "4":</w:t>
+              <w:br/>
+              <w:t xml:space="preserve">        # Бинарные отношения и расстояния Кемени</w:t>
+              <w:br/>
+              <w:t xml:space="preserve">        if not ctx.relations:</w:t>
+              <w:br/>
+              <w:t xml:space="preserve">            ctx.relations = get_binary_relations(ctx.transformed, ctx.objects)</w:t>
+              <w:br/>
+              <w:t xml:space="preserve">        if ctx.distances is None:</w:t>
+              <w:br/>
+              <w:t xml:space="preserve">            ctx.distances = build_distance_matrix(ctx.relations)</w:t>
+              <w:br/>
+              <w:t xml:space="preserve">        if not ctx.sums:</w:t>
+              <w:br/>
+              <w:t xml:space="preserve">            ctx.sums = get_row_sums(ctx.distances)</w:t>
+              <w:br/>
+              <w:t xml:space="preserve">        if not ctx.medians_experts:</w:t>
+              <w:br/>
+              <w:t xml:space="preserve">            ctx.medians_experts = get_kemeny_medians_by_experts(ctx.distances)</w:t>
+              <w:br/>
+              <w:br/>
+              <w:t xml:space="preserve">        print_binary_relations(ctx.relations)</w:t>
+              <w:br/>
+              <w:t xml:space="preserve">        print_distance_matrix(ctx.distances)</w:t>
+              <w:br/>
+              <w:t xml:space="preserve">        print_kemeny_median_by_experts(</w:t>
+              <w:br/>
+              <w:t xml:space="preserve">            ctx.distances, ctx.transformed, ctx.medians_experts, ctx.sums</w:t>
+              <w:br/>
+              <w:t xml:space="preserve">        )</w:t>
+              <w:br/>
+              <w:br/>
+              <w:t xml:space="preserve">    elif code == "5":</w:t>
+              <w:br/>
+              <w:t xml:space="preserve">        # Векторы предпочтений и матрица потерь</w:t>
               <w:br/>
               <w:t xml:space="preserve">        if not ctx.preferences:</w:t>
               <w:br/>
@@ -12587,25 +12853,35 @@
               <w:t xml:space="preserve">        print_preference_vectors(ctx.preferences, ctx.objects)</w:t>
               <w:br/>
               <w:br/>
-              <w:t xml:space="preserve">    elif stage == "relations":</w:t>
-              <w:br/>
-              <w:t xml:space="preserve">        ctx.relations = get_binary_relations(ctx.transformed, ctx.objects)</w:t>
-              <w:br/>
-              <w:t xml:space="preserve">        print_binary_relations(ctx.relations)</w:t>
-              <w:br/>
-              <w:br/>
-              <w:t xml:space="preserve">    elif stage == "distances":</w:t>
+              <w:t xml:space="preserve">    elif code == "6":</w:t>
+              <w:br/>
+              <w:t xml:space="preserve">        # Задача о назначениях</w:t>
+              <w:br/>
+              <w:t xml:space="preserve">        orders, total, loss = get_all_assignment_medians(ctx.transformed, ctx.objects)</w:t>
+              <w:br/>
+              <w:t xml:space="preserve">        ctx.assignment = (orders, total, loss)</w:t>
+              <w:br/>
+              <w:t xml:space="preserve">        print_kemeny_assignment(orders, total, loss)</w:t>
+              <w:br/>
+              <w:br/>
+              <w:t xml:space="preserve">    elif code == "7":</w:t>
+              <w:br/>
+              <w:t xml:space="preserve">        # Истинная медиана Кемени (полный перебор)</w:t>
               <w:br/>
               <w:t xml:space="preserve">        if not ctx.relations:</w:t>
               <w:br/>
               <w:t xml:space="preserve">            ctx.relations = get_binary_relations(ctx.transformed, ctx.objects)</w:t>
               <w:br/>
-              <w:t xml:space="preserve">        ctx.distances = build_distance_matrix(ctx.relations)</w:t>
-              <w:br/>
-              <w:t xml:space="preserve">        print_distance_matrix(ctx.distances)</w:t>
-              <w:br/>
-              <w:br/>
-              <w:t xml:space="preserve">    elif stage == "diffs":</w:t>
+              <w:t xml:space="preserve">        orders, total = get_all_kemeny_medians_bruteforce(ctx.relations, ctx.objects)</w:t>
+              <w:br/>
+              <w:t xml:space="preserve">        ctx.bruteforce = (orders, total)</w:t>
+              <w:br/>
+              <w:t xml:space="preserve">        print_kemeny_bruteforce(orders, total, num_checked=120 if len(ctx.objects) == 5 else len(orders))</w:t>
+              <w:br/>
+              <w:br/>
+              <w:t xml:space="preserve">    elif code == "8":</w:t>
+              <w:br/>
+              <w:t xml:space="preserve">        # Сводное сопоставление подходов</w:t>
               <w:br/>
               <w:t xml:space="preserve">        if not ctx.relations:</w:t>
               <w:br/>
@@ -12615,201 +12891,384 @@
               <w:br/>
               <w:t xml:space="preserve">            ctx.distances = build_distance_matrix(ctx.relations)</w:t>
               <w:br/>
-              <w:t xml:space="preserve">        ctx.diffs = get_diff_relations_matrixes(ctx.relations)</w:t>
-              <w:br/>
-              <w:t xml:space="preserve">        print_diff_relations_matrixes(ctx.diffs, ctx.distances)</w:t>
-              <w:br/>
-              <w:br/>
-              <w:t xml:space="preserve">    elif stage == "kemeny_experts":</w:t>
+              <w:t xml:space="preserve">        if not ctx.medians_experts:</w:t>
+              <w:br/>
+              <w:t xml:space="preserve">            ctx.medians_experts = get_kemeny_medians_by_experts(ctx.distances)</w:t>
+              <w:br/>
+              <w:br/>
+              <w:t xml:space="preserve">        if ctx.assignment is None:</w:t>
+              <w:br/>
+              <w:t xml:space="preserve">            ctx.assignment = get_all_assignment_medians(ctx.transformed, ctx.objects)</w:t>
+              <w:br/>
+              <w:t xml:space="preserve">        if ctx.bruteforce is None:</w:t>
+              <w:br/>
+              <w:t xml:space="preserve">            ctx.bruteforce = get_all_kemeny_medians_bruteforce(ctx.relations, ctx.objects)</w:t>
+              <w:br/>
+              <w:br/>
+              <w:t xml:space="preserve">        assign_orders, assign_total, _ = ctx.assignment</w:t>
+              <w:br/>
+              <w:t xml:space="preserve">        kemeny_orders, kemeny_total = ctx.bruteforce</w:t>
+              <w:br/>
+              <w:br/>
+              <w:t xml:space="preserve">        print_kemeny_comparison(</w:t>
+              <w:br/>
+              <w:t xml:space="preserve">            relations=ctx.relations,</w:t>
+              <w:br/>
+              <w:t xml:space="preserve">            objects=ctx.objects,</w:t>
+              <w:br/>
+              <w:t xml:space="preserve">            transformed=ctx.transformed,</w:t>
+              <w:br/>
+              <w:t xml:space="preserve">            distances=ctx.distances,</w:t>
+              <w:br/>
+              <w:t xml:space="preserve">            medians_experts=ctx.medians_experts,</w:t>
+              <w:br/>
+              <w:t xml:space="preserve">            assignment_orders=assign_orders,</w:t>
+              <w:br/>
+              <w:t xml:space="preserve">            assignment_total=assign_total,</w:t>
+              <w:br/>
+              <w:t xml:space="preserve">            bruteforce_orders=kemeny_orders,</w:t>
+              <w:br/>
+              <w:t xml:space="preserve">            bruteforce_total=kemeny_total,</w:t>
+              <w:br/>
+              <w:t xml:space="preserve">        )</w:t>
+              <w:br/>
+              <w:br/>
+              <w:t xml:space="preserve">    elif code == "9":</w:t>
+              <w:br/>
+              <w:t xml:space="preserve">        # Итоговая аналитическая интерпретация</w:t>
               <w:br/>
               <w:t xml:space="preserve">        if not ctx.relations:</w:t>
               <w:br/>
               <w:t xml:space="preserve">            ctx.relations = get_binary_relations(ctx.transformed, ctx.objects)</w:t>
               <w:br/>
-              <w:t xml:space="preserve">        if ctx.distances is None:</w:t>
-              <w:br/>
-              <w:t xml:space="preserve">            ctx.distances = build_distance_matrix(ctx.relations)</w:t>
-              <w:br/>
-              <w:t xml:space="preserve">        ctx.sums = get_row_sums(ctx.distances)</w:t>
-              <w:br/>
-              <w:t xml:space="preserve">        ctx.medians_experts = get_kemeny_medians_by_experts(ctx.distances)</w:t>
-              <w:br/>
-              <w:t xml:space="preserve">        print_kemeny_median_by_experts(</w:t>
-              <w:br/>
-              <w:t xml:space="preserve">            ctx.distances, ctx.transformed, ctx.medians_experts, ctx.sums</w:t>
+              <w:t xml:space="preserve">        if ctx.assignment is None:</w:t>
+              <w:br/>
+              <w:t xml:space="preserve">            ctx.assignment = get_all_assignment_medians(ctx.transformed, ctx.objects)</w:t>
+              <w:br/>
+              <w:t xml:space="preserve">        if ctx.bruteforce is None:</w:t>
+              <w:br/>
+              <w:t xml:space="preserve">            ctx.bruteforce = get_all_kemeny_medians_bruteforce(ctx.relations, ctx.objects)</w:t>
+              <w:br/>
+              <w:br/>
+              <w:t xml:space="preserve">        assign_orders, assign_total, _ = ctx.assignment</w:t>
+              <w:br/>
+              <w:t xml:space="preserve">        kemeny_orders, kemeny_total = ctx.bruteforce</w:t>
+              <w:br/>
+              <w:br/>
+              <w:t xml:space="preserve">        print_analytical_interpretation(</w:t>
+              <w:br/>
+              <w:t xml:space="preserve">            table=ctx.transformed,</w:t>
+              <w:br/>
+              <w:t xml:space="preserve">            objects=ctx.objects,</w:t>
+              <w:br/>
+              <w:t xml:space="preserve">            relations=ctx.relations,</w:t>
+              <w:br/>
+              <w:t xml:space="preserve">            assignment_orders=assign_orders,</w:t>
+              <w:br/>
+              <w:t xml:space="preserve">            assignment_total=assign_total,</w:t>
+              <w:br/>
+              <w:t xml:space="preserve">            bruteforce_orders=kemeny_orders,</w:t>
+              <w:br/>
+              <w:t xml:space="preserve">            bruteforce_total=kemeny_total,</w:t>
               <w:br/>
               <w:t xml:space="preserve">        )</w:t>
               <w:br/>
               <w:br/>
-              <w:t xml:space="preserve">    elif stage == "kemeny_assignment":</w:t>
-              <w:br/>
-              <w:t xml:space="preserve">        orders, total, loss = get_all_assignment_medians(</w:t>
-              <w:br/>
-              <w:t xml:space="preserve">            ctx.transformed,</w:t>
-              <w:br/>
-              <w:t xml:space="preserve">            ctx.objects,</w:t>
-              <w:br/>
-              <w:t xml:space="preserve">        )</w:t>
-              <w:br/>
-              <w:br/>
-              <w:t xml:space="preserve">        ctx.assignment = (orders, total, loss)</w:t>
-              <w:br/>
-              <w:br/>
-              <w:t xml:space="preserve">        print_kemeny_assignment(</w:t>
-              <w:br/>
-              <w:t xml:space="preserve">            orders,</w:t>
-              <w:br/>
-              <w:t xml:space="preserve">            total,</w:t>
-              <w:br/>
-              <w:t xml:space="preserve">            loss,</w:t>
-              <w:br/>
-              <w:t xml:space="preserve">        )</w:t>
-              <w:br/>
-              <w:br/>
-              <w:t xml:space="preserve">    elif stage == "kemeny_bruteforce":</w:t>
-              <w:br/>
-              <w:t xml:space="preserve">        if not ctx.relations:</w:t>
-              <w:br/>
-              <w:t xml:space="preserve">            ctx.relations = get_binary_relations(ctx.transformed, ctx.objects)</w:t>
-              <w:br/>
-              <w:t xml:space="preserve">        orders, total = get_all_kemeny_medians_bruteforce(</w:t>
-              <w:br/>
-              <w:t xml:space="preserve">            ctx.relations, ctx.objects</w:t>
-              <w:br/>
-              <w:t xml:space="preserve">        )</w:t>
-              <w:br/>
-              <w:t xml:space="preserve">        ctx.bruteforce = (orders, total)</w:t>
-              <w:br/>
-              <w:t xml:space="preserve">        print(f"\nПроверка (полный перебор), все оптимумы (Σ = {total}):")</w:t>
-              <w:br/>
-              <w:t xml:space="preserve">        for o in orders:</w:t>
-              <w:br/>
-              <w:t xml:space="preserve">            print(f"   {' &gt; '.join(o)}")</w:t>
-              <w:br/>
-              <w:t xml:space="preserve">    </w:t>
-              <w:br/>
-              <w:t xml:space="preserve">    elif stage == "kemeny_compare":</w:t>
-              <w:br/>
-              <w:t xml:space="preserve">        if not ctx.relations:</w:t>
-              <w:br/>
-              <w:t xml:space="preserve">            ctx.relations = get_binary_relations(ctx.transformed, ctx.objects)</w:t>
-              <w:br/>
-              <w:t xml:space="preserve">        if ctx.distances is None:</w:t>
-              <w:br/>
-              <w:t xml:space="preserve">            ctx.distances = build_distance_matrix(ctx.relations)</w:t>
-              <w:br/>
-              <w:t xml:space="preserve">        if not ctx.sums:</w:t>
-              <w:br/>
-              <w:t xml:space="preserve">            ctx.sums = get_row_sums(ctx.distances)</w:t>
-              <w:br/>
-              <w:t xml:space="preserve">        if not ctx.medians_experts:</w:t>
-              <w:br/>
-              <w:t xml:space="preserve">            ctx.medians_experts = get_kemeny_medians_by_experts(ctx.distances)</w:t>
-              <w:br/>
-              <w:br/>
-              <w:t xml:space="preserve">        if ctx.assignment is None:</w:t>
-              <w:br/>
-              <w:t xml:space="preserve">            ctx.assignment = get_all_assignment_medians(</w:t>
-              <w:br/>
-              <w:t xml:space="preserve">                ctx.transformed,</w:t>
-              <w:br/>
-              <w:t xml:space="preserve">                ctx.objects,</w:t>
-              <w:br/>
-              <w:t xml:space="preserve">            )</w:t>
-              <w:br/>
-              <w:br/>
-              <w:t xml:space="preserve">        if ctx.bruteforce is None:</w:t>
-              <w:br/>
-              <w:t xml:space="preserve">            ctx.bruteforce = get_all_kemeny_medians_bruteforce(</w:t>
-              <w:br/>
-              <w:t xml:space="preserve">                ctx.relations,</w:t>
-              <w:br/>
-              <w:t xml:space="preserve">                ctx.objects,</w:t>
-              <w:br/>
-              <w:t xml:space="preserve">            )</w:t>
-              <w:br/>
-              <w:br/>
-              <w:t xml:space="preserve">        assignment_orders, assignment_total, _ = ctx.assignment</w:t>
-              <w:br/>
-              <w:t xml:space="preserve">        bruteforce_orders, bruteforce_total = ctx.bruteforce</w:t>
-              <w:br/>
-              <w:br/>
-              <w:t xml:space="preserve">        print_kemeny_comparison(</w:t>
-              <w:br/>
-              <w:t xml:space="preserve">            relations=ctx.relations,</w:t>
-              <w:br/>
-              <w:t xml:space="preserve">            objects=ctx.objects,</w:t>
-              <w:br/>
-              <w:t xml:space="preserve">            transformed=ctx.transformed,</w:t>
-              <w:br/>
-              <w:t xml:space="preserve">            distances=ctx.distances,</w:t>
-              <w:br/>
-              <w:t xml:space="preserve">            medians_experts=ctx.medians_experts,</w:t>
-              <w:br/>
-              <w:t xml:space="preserve">            assignment_orders=assignment_orders,</w:t>
-              <w:br/>
-              <w:t xml:space="preserve">            assignment_total=assignment_total,</w:t>
-              <w:br/>
-              <w:t xml:space="preserve">            bruteforce_orders=bruteforce_orders,</w:t>
-              <w:br/>
-              <w:t xml:space="preserve">            bruteforce_total=bruteforce_total,</w:t>
-              <w:br/>
-              <w:t xml:space="preserve">        )</w:t>
-              <w:br/>
-              <w:br/>
-              <w:t># ---------- меню ----------</w:t>
+              <w:br/>
+              <w:t># =========================================================================</w:t>
+              <w:br/>
+              <w:t># ИНТЕРАКТИВНЫЙ ВВОД ДАННЫХ С КЛАВИАТУРЫ</w:t>
+              <w:br/>
+              <w:t># =========================================================================</w:t>
+              <w:br/>
+              <w:br/>
+              <w:t>def input_custom_rankings(ctx: Context) -&gt; None:</w:t>
+              <w:br/>
+              <w:t xml:space="preserve">    """Обеспечивает дружественный пошаговый ввод данных экспертов с валидацией."""</w:t>
+              <w:br/>
+              <w:t xml:space="preserve">    print("\n" + "═" * 76)</w:t>
+              <w:br/>
+              <w:t xml:space="preserve">    print("  ИНТЕРАКТИВНЫЙ ВВОД СУЖДЕНИЙ ЭКСПЕРТОВ")</w:t>
+              <w:br/>
+              <w:t xml:space="preserve">    print("═" * 76)</w:t>
+              <w:br/>
+              <w:t xml:space="preserve">    print("Вы можете ввести собственные экспертные оценки для анализа.")</w:t>
+              <w:br/>
+              <w:br/>
+              <w:t xml:space="preserve">    # 1. Запрос объектов</w:t>
+              <w:br/>
+              <w:t xml:space="preserve">    default_objs_str = " ".join(ctx.objects) if ctx.objects else "a1 a2 a3 a4 a5"</w:t>
+              <w:br/>
+              <w:t xml:space="preserve">    print(f"\nВведите список исследуемых альтернатив через пробел.")</w:t>
+              <w:br/>
+              <w:t xml:space="preserve">    print(f"[Нажмите Enter для использования по умолчанию: {default_objs_str}]")</w:t>
+              <w:br/>
+              <w:t xml:space="preserve">    try:</w:t>
+              <w:br/>
+              <w:t xml:space="preserve">        user_objs = input("Альтернативы: ").strip()</w:t>
+              <w:br/>
+              <w:t xml:space="preserve">    except (EOFError, KeyboardInterrupt):</w:t>
+              <w:br/>
+              <w:t xml:space="preserve">        print("\nВвод отменён.")</w:t>
+              <w:br/>
+              <w:t xml:space="preserve">        return</w:t>
+              <w:br/>
+              <w:br/>
+              <w:t xml:space="preserve">    if user_objs:</w:t>
+              <w:br/>
+              <w:t xml:space="preserve">        target_objects = user_objs.split()</w:t>
+              <w:br/>
+              <w:t xml:space="preserve">    else:</w:t>
+              <w:br/>
+              <w:t xml:space="preserve">        target_objects = default_objs_str.split()</w:t>
+              <w:br/>
+              <w:br/>
+              <w:t xml:space="preserve">    target_set = set(target_objects)</w:t>
+              <w:br/>
+              <w:t xml:space="preserve">    n = len(target_objects)</w:t>
+              <w:br/>
+              <w:br/>
+              <w:t xml:space="preserve">    # 2. Количество экспертов</w:t>
+              <w:br/>
+              <w:t xml:space="preserve">    print(f"\nВведите количество экспертов в комиссии (например, 5):")</w:t>
+              <w:br/>
+              <w:t xml:space="preserve">    while True:</w:t>
+              <w:br/>
+              <w:t xml:space="preserve">        try:</w:t>
+              <w:br/>
+              <w:t xml:space="preserve">            m_input = input("Количество экспертов: ").strip()</w:t>
+              <w:br/>
+              <w:t xml:space="preserve">            m = int(m_input)</w:t>
+              <w:br/>
+              <w:t xml:space="preserve">            if m &lt; 2:</w:t>
+              <w:br/>
+              <w:t xml:space="preserve">                print("⚠ В комиссии должно быть как минимум 2 эксперта. Попробуйте снова.")</w:t>
+              <w:br/>
+              <w:t xml:space="preserve">                continue</w:t>
+              <w:br/>
+              <w:t xml:space="preserve">            break</w:t>
+              <w:br/>
+              <w:t xml:space="preserve">        except ValueError:</w:t>
+              <w:br/>
+              <w:t xml:space="preserve">            print("⚠ Пожалуйста, введите целое положительное число.")</w:t>
+              <w:br/>
+              <w:t xml:space="preserve">        except (EOFError, KeyboardInterrupt):</w:t>
+              <w:br/>
+              <w:t xml:space="preserve">            print("\nВвод отменён.")</w:t>
+              <w:br/>
+              <w:t xml:space="preserve">            return</w:t>
+              <w:br/>
+              <w:br/>
+              <w:t xml:space="preserve">    # 3. Ввод суждений для каждого эксперта</w:t>
+              <w:br/>
+              <w:t xml:space="preserve">    print("\n────────────────────────────────────────────────────────────────────────────")</w:t>
+              <w:br/>
+              <w:t xml:space="preserve">    print(f"Введите ранжирование для каждого эксперта.")</w:t>
+              <w:br/>
+              <w:t xml:space="preserve">    print(f"Порядок ввода: от наиболее предпочтительной альтернативы к наименее.")</w:t>
+              <w:br/>
+              <w:t xml:space="preserve">    print(f"Допустимые обозначения проектов: {' '.join(target_objects)}")</w:t>
+              <w:br/>
+              <w:t xml:space="preserve">    print("────────────────────────────────────────────────────────────────────────────")</w:t>
+              <w:br/>
+              <w:br/>
+              <w:t xml:space="preserve">    new_table: Dict[int, List[str]] = {}</w:t>
+              <w:br/>
+              <w:br/>
+              <w:t xml:space="preserve">    for k in range(1, m + 1):</w:t>
+              <w:br/>
+              <w:t xml:space="preserve">        while True:</w:t>
+              <w:br/>
+              <w:t xml:space="preserve">            try:</w:t>
+              <w:br/>
+              <w:t xml:space="preserve">                print(f"\nЭксперт Э{k}:")</w:t>
+              <w:br/>
+              <w:t xml:space="preserve">                line = input(f"Ранжирование Э{k} &gt; ").strip()</w:t>
+              <w:br/>
+              <w:t xml:space="preserve">            except (EOFError, KeyboardInterrupt):</w:t>
+              <w:br/>
+              <w:t xml:space="preserve">                print("\nВвод прерван.")</w:t>
+              <w:br/>
+              <w:t xml:space="preserve">                return</w:t>
+              <w:br/>
+              <w:br/>
+              <w:t xml:space="preserve">            if not line:</w:t>
+              <w:br/>
+              <w:t xml:space="preserve">                print("⚠ Строка не может быть пустой. Попробуйте снова.")</w:t>
+              <w:br/>
+              <w:t xml:space="preserve">                continue</w:t>
+              <w:br/>
+              <w:br/>
+              <w:t xml:space="preserve">            tokens = line.split()</w:t>
+              <w:br/>
+              <w:br/>
+              <w:t xml:space="preserve">            if len(tokens) != n:</w:t>
+              <w:br/>
+              <w:t xml:space="preserve">                print(f"⚠ Неверное число проектов ({len(tokens)} вместо {n}).")</w:t>
+              <w:br/>
+              <w:t xml:space="preserve">                print(f"   Каждый из {n} проектов должен присутствовать ровно один раз.")</w:t>
+              <w:br/>
+              <w:t xml:space="preserve">                continue</w:t>
+              <w:br/>
+              <w:br/>
+              <w:t xml:space="preserve">            tokens_set = set(tokens)</w:t>
+              <w:br/>
+              <w:t xml:space="preserve">            missing = target_set - tokens_set</w:t>
+              <w:br/>
+              <w:t xml:space="preserve">            unknown = tokens_set - target_set</w:t>
+              <w:br/>
+              <w:br/>
+              <w:t xml:space="preserve">            if unknown:</w:t>
+              <w:br/>
+              <w:t xml:space="preserve">                print(f"⚠ Обнаружены неизвестные обозначения: {', '.join(unknown)}.")</w:t>
+              <w:br/>
+              <w:t xml:space="preserve">                print(f"   Ожидались только: {' '.join(target_objects)}.")</w:t>
+              <w:br/>
+              <w:t xml:space="preserve">                continue</w:t>
+              <w:br/>
+              <w:br/>
+              <w:t xml:space="preserve">            if missing:</w:t>
+              <w:br/>
+              <w:t xml:space="preserve">                print(f"⚠ Пропущены обязательные проекты: {', '.join(missing)}.")</w:t>
+              <w:br/>
+              <w:t xml:space="preserve">                continue</w:t>
+              <w:br/>
+              <w:br/>
+              <w:t xml:space="preserve">            # Успешный ввод</w:t>
+              <w:br/>
+              <w:t xml:space="preserve">            new_table[k] = tokens</w:t>
+              <w:br/>
+              <w:t xml:space="preserve">            print(f"✓ Ранжирование эксперта Э{k} принято: {' ≻ '.join(tokens)}")</w:t>
+              <w:br/>
+              <w:t xml:space="preserve">            break</w:t>
+              <w:br/>
+              <w:br/>
+              <w:t xml:space="preserve">    # 4. Вопрос о сохранении в файл</w:t>
+              <w:br/>
+              <w:t xml:space="preserve">    print("\n✓ Все суждения экспертов успешно приняты!")</w:t>
+              <w:br/>
+              <w:t xml:space="preserve">    try:</w:t>
+              <w:br/>
+              <w:t xml:space="preserve">        save_choice = input("Сохранить эти данные в файл input.txt? (y/n, по умолчанию n): ").strip().lower()</w:t>
+              <w:br/>
+              <w:t xml:space="preserve">        if save_choice in ("y", "yes", "д", "да"):</w:t>
+              <w:br/>
+              <w:t xml:space="preserve">            with open("input.txt", "w", encoding="utf-8") as f:</w:t>
+              <w:br/>
+              <w:t xml:space="preserve">                for k in sorted(new_table.keys()):</w:t>
+              <w:br/>
+              <w:t xml:space="preserve">                    f.write(" ".join(new_table[k]) + "\n")</w:t>
+              <w:br/>
+              <w:t xml:space="preserve">            print("✓ Данные сохранены в файл input.txt.")</w:t>
+              <w:br/>
+              <w:t xml:space="preserve">            ctx.set_data(new_table, label="input.txt (обновлён)")</w:t>
+              <w:br/>
+              <w:t xml:space="preserve">        else:</w:t>
+              <w:br/>
+              <w:t xml:space="preserve">            ctx.set_data(new_table, label="Пользовательский ввод (в памяти)")</w:t>
+              <w:br/>
+              <w:t xml:space="preserve">    except Exception as e:</w:t>
+              <w:br/>
+              <w:t xml:space="preserve">        print(f"⚠ Не удалось сохранить в файл: {e}")</w:t>
+              <w:br/>
+              <w:t xml:space="preserve">        ctx.set_data(new_table, label="Пользовательский ввод (в памяти)")</w:t>
+              <w:br/>
+              <w:br/>
+              <w:t xml:space="preserve">    print("✓ Текущий контекст обновлён. Теперь вы можете запустить анализ.")</w:t>
+              <w:br/>
+              <w:br/>
+              <w:br/>
+              <w:t># =========================================================================</w:t>
+              <w:br/>
+              <w:t># ГЛАВНОЕ МЕНЮ И ЦИКЛ ВЗАИМОДЕЙСТВИЯ (REPL)</w:t>
+              <w:br/>
+              <w:t># =========================================================================</w:t>
               <w:br/>
               <w:br/>
               <w:t>def print_menu(ctx: Context) -&gt; None:</w:t>
               <w:br/>
+              <w:t xml:space="preserve">    """Выводит стилизованное главное меню программы."""</w:t>
+              <w:br/>
+              <w:t xml:space="preserve">    m_exp = len(ctx.raw)</w:t>
+              <w:br/>
+              <w:t xml:space="preserve">    n_obj = len(ctx.objects)</w:t>
+              <w:br/>
+              <w:br/>
               <w:t xml:space="preserve">    print()</w:t>
               <w:br/>
-              <w:t xml:space="preserve">    print(f"Файл: {ctx.filepath}   (экспертов: {len(ctx.raw)}, объектов: {len(ctx.objects)})")</w:t>
-              <w:br/>
-              <w:t xml:space="preserve">    print("-" * 50)</w:t>
-              <w:br/>
-              <w:t xml:space="preserve">    for i, stage in enumerate(STAGES, start=1):</w:t>
-              <w:br/>
-              <w:t xml:space="preserve">        print(f"  {i:&gt;2}. {STAGE_TITLES.get(stage, stage)}")</w:t>
-              <w:br/>
-              <w:t xml:space="preserve">    print("   0. Выход")</w:t>
-              <w:br/>
-              <w:t xml:space="preserve">    print("   a. Все этапы")</w:t>
-              <w:br/>
-              <w:t xml:space="preserve">    print("   f. Сменить файл")</w:t>
-              <w:br/>
-              <w:br/>
-              <w:t>def parse_choice(choice: str) -&gt; list[str]:</w:t>
-              <w:br/>
-              <w:t xml:space="preserve">    """Разбирает ввод пользователя в список этапов."""</w:t>
-              <w:br/>
-              <w:t xml:space="preserve">    choice = choice.strip().lower()</w:t>
-              <w:br/>
-              <w:br/>
-              <w:t xml:space="preserve">    if choice == "a":</w:t>
-              <w:br/>
-              <w:t xml:space="preserve">        return list(STAGES)</w:t>
-              <w:br/>
-              <w:br/>
-              <w:t xml:space="preserve">    stages = []</w:t>
-              <w:br/>
-              <w:t xml:space="preserve">    for token in choice.replace(",", " ").split():</w:t>
-              <w:br/>
-              <w:t xml:space="preserve">        if token.isdigit():</w:t>
-              <w:br/>
-              <w:t xml:space="preserve">            idx = int(token) - 1</w:t>
-              <w:br/>
-              <w:t xml:space="preserve">            if 0 &lt;= idx &lt; len(STAGES):</w:t>
-              <w:br/>
-              <w:t xml:space="preserve">                stages.append(STAGES[idx])</w:t>
-              <w:br/>
-              <w:t xml:space="preserve">    return stages</w:t>
+              <w:t xml:space="preserve">    print("╔══════════════════════════════════════════════════════════════════════════════╗")</w:t>
+              <w:br/>
+              <w:t xml:space="preserve">    print("║        ИССЛЕДОВАНИЕ СЛОЖНЫХ СИСТЕМ МЕТОДОМ ЭКСПЕРТНЫХ ОЦЕНОК (ММАСС)         ║")</w:t>
+              <w:br/>
+              <w:t xml:space="preserve">    print("╚══════════════════════════════════════════════════════════════════════════════╝")</w:t>
+              <w:br/>
+              <w:t xml:space="preserve">    print(f"  Источник данных: {ctx.source_label}  |  Экспертов: {m_exp}  |  Альтернатив: {n_obj}")</w:t>
+              <w:br/>
+              <w:t xml:space="preserve">    print("────────────────────────────────────────────────────────────────────────────────")</w:t>
+              <w:br/>
+              <w:t xml:space="preserve">    print("  1. Исходные суждения экспертов и матрица рангов")</w:t>
+              <w:br/>
+              <w:t xml:space="preserve">    print("  2. Метод средних арифметических рангов")</w:t>
+              <w:br/>
+              <w:t xml:space="preserve">    print("  3. Метод медианных рангов (робастная статистика)")</w:t>
+              <w:br/>
+              <w:t xml:space="preserve">    print("  4. Бинарные отношения и расстояния Кемени (матрица D, суммы S_k)")</w:t>
+              <w:br/>
+              <w:t xml:space="preserve">    print("  5. Векторы предпочтений π^(k) и матрица позиционных потерь")</w:t>
+              <w:br/>
+              <w:t xml:space="preserve">    print("  6. Задача о назначениях (минимизация позиционных потерь Φ_Assign)")</w:t>
+              <w:br/>
+              <w:t xml:space="preserve">    print("  7. Истинная медиана Кемени (полный перебор всех n! перестановок)")</w:t>
+              <w:br/>
+              <w:t xml:space="preserve">    print("  8. Сводное сопоставление результатов всех методов")</w:t>
+              <w:br/>
+              <w:t xml:space="preserve">    print("  9. Итоговая аналитическая интерпретация группового выбора")</w:t>
+              <w:br/>
+              <w:t xml:space="preserve">    print("────────────────────────────────────────────────────────────────────────────────")</w:t>
+              <w:br/>
+              <w:t xml:space="preserve">    print("  a. Выполнить полный расчёт (все этапы с аналитикой)")</w:t>
+              <w:br/>
+              <w:t xml:space="preserve">    print("  i. Ввести новые данные экспертов с клавиатуры")</w:t>
+              <w:br/>
+              <w:t xml:space="preserve">    print("  f. Загрузить данные из другого файла")</w:t>
+              <w:br/>
+              <w:t xml:space="preserve">    print("  0. Завершить работу программы")</w:t>
+              <w:br/>
+              <w:t xml:space="preserve">    print("────────────────────────────────────────────────────────────────────────────────")</w:t>
+              <w:br/>
+              <w:br/>
+              <w:br/>
+              <w:t>def parse_user_choice(choice_str: str) -&gt; List[str]:</w:t>
+              <w:br/>
+              <w:t xml:space="preserve">    """Разбирает выбор пользователя в упорядоченный список этапов."""</w:t>
+              <w:br/>
+              <w:t xml:space="preserve">    choice = choice_str.strip().lower()</w:t>
+              <w:br/>
+              <w:t xml:space="preserve">    if choice in ("a", "all", "все"):</w:t>
+              <w:br/>
+              <w:t xml:space="preserve">        return ["1", "2", "3", "4", "5", "6", "7", "8", "9"]</w:t>
+              <w:br/>
+              <w:br/>
+              <w:t xml:space="preserve">    valid_stages = []</w:t>
+              <w:br/>
+              <w:t xml:space="preserve">    # Поддерживаем ввод через пробел, запятую или подряд: "1 2 3" или "2, 3"</w:t>
+              <w:br/>
+              <w:t xml:space="preserve">    tokens = choice.replace(",", " ").split()</w:t>
+              <w:br/>
+              <w:t xml:space="preserve">    for tok in tokens:</w:t>
+              <w:br/>
+              <w:t xml:space="preserve">        if tok in {"1", "2", "3", "4", "5", "6", "7", "8", "9"}:</w:t>
+              <w:br/>
+              <w:t xml:space="preserve">            valid_stages.append(tok)</w:t>
+              <w:br/>
+              <w:br/>
+              <w:t xml:space="preserve">    return valid_stages</w:t>
+              <w:br/>
               <w:br/>
               <w:br/>
               <w:t>def repl(ctx: Context) -&gt; None:</w:t>
               <w:br/>
-              <w:t xml:space="preserve">    print("=== Выбор вывода ===")</w:t>
-              <w:br/>
+              <w:t xml:space="preserve">    """Главный интерактивный цикл управления."""</w:t>
               <w:br/>
               <w:t xml:space="preserve">    while True:</w:t>
               <w:br/>
@@ -12817,86 +13276,108 @@
               <w:br/>
               <w:t xml:space="preserve">        try:</w:t>
               <w:br/>
-              <w:t xml:space="preserve">            choice = input("&gt; ").strip()</w:t>
+              <w:t xml:space="preserve">            choice = input("Выберите пункт меню &gt; ").strip().lower()</w:t>
               <w:br/>
               <w:t xml:space="preserve">        except (EOFError, KeyboardInterrupt):</w:t>
               <w:br/>
-              <w:t xml:space="preserve">            print("\nВыход.")</w:t>
+              <w:t xml:space="preserve">            print("\n\nРабота программы завершена. До свидания!")</w:t>
               <w:br/>
               <w:t xml:space="preserve">            return</w:t>
               <w:br/>
               <w:br/>
-              <w:t xml:space="preserve">        if choice in ("0", "q", "quit", "exit"):</w:t>
-              <w:br/>
-              <w:t xml:space="preserve">            print("Выход.")</w:t>
+              <w:t xml:space="preserve">        if not choice:</w:t>
+              <w:br/>
+              <w:t xml:space="preserve">            continue</w:t>
+              <w:br/>
+              <w:br/>
+              <w:t xml:space="preserve">        if choice in ("0", "q", "quit", "exit", "вых", "выход"):</w:t>
+              <w:br/>
+              <w:t xml:space="preserve">            print("\nРабота программы успешно завершена. Спасибо за использование системы экспертных оценок!")</w:t>
               <w:br/>
               <w:t xml:space="preserve">            return</w:t>
               <w:br/>
               <w:br/>
+              <w:t xml:space="preserve">        if choice == "i":</w:t>
+              <w:br/>
+              <w:t xml:space="preserve">            input_custom_rankings(ctx)</w:t>
+              <w:br/>
+              <w:t xml:space="preserve">            continue</w:t>
+              <w:br/>
+              <w:br/>
               <w:t xml:space="preserve">        if choice == "f":</w:t>
               <w:br/>
-              <w:t xml:space="preserve">            path = input("Путь к файлу: ").strip()</w:t>
-              <w:br/>
-              <w:t xml:space="preserve">            if not path:</w:t>
-              <w:br/>
-              <w:t xml:space="preserve">                continue</w:t>
-              <w:br/>
               <w:t xml:space="preserve">            try:</w:t>
               <w:br/>
-              <w:t xml:space="preserve">                ctx.filepath = path</w:t>
-              <w:br/>
-              <w:t xml:space="preserve">                ctx.load()</w:t>
-              <w:br/>
-              <w:t xml:space="preserve">                print(f"Загружено: {ctx.filepath}")</w:t>
+              <w:t xml:space="preserve">                new_path = input("\nВведите путь к файлу с данными: ").strip()</w:t>
+              <w:br/>
+              <w:t xml:space="preserve">                if not new_path:</w:t>
+              <w:br/>
+              <w:t xml:space="preserve">                    print("⚠ Путь не указан.")</w:t>
+              <w:br/>
+              <w:t xml:space="preserve">                    continue</w:t>
+              <w:br/>
+              <w:t xml:space="preserve">                ctx.load(new_path)</w:t>
+              <w:br/>
+              <w:t xml:space="preserve">                print(f"✓ Успешно загружен файл: {new_path}")</w:t>
               <w:br/>
               <w:t xml:space="preserve">            except FileNotFoundError:</w:t>
               <w:br/>
-              <w:t xml:space="preserve">                print(f"Файл не найден: {path}")</w:t>
+              <w:t xml:space="preserve">                print(f"⚠ Ошибка: файл не найден по пути '{new_path}'.")</w:t>
+              <w:br/>
+              <w:t xml:space="preserve">            except Exception as e:</w:t>
+              <w:br/>
+              <w:t xml:space="preserve">                print(f"⚠ Ошибка чтения файла: {e}")</w:t>
               <w:br/>
               <w:t xml:space="preserve">            continue</w:t>
               <w:br/>
               <w:br/>
-              <w:t xml:space="preserve">        stages = parse_choice(choice)</w:t>
+              <w:t xml:space="preserve">        stages = parse_user_choice(choice)</w:t>
               <w:br/>
               <w:t xml:space="preserve">        if not stages:</w:t>
               <w:br/>
+              <w:t xml:space="preserve">            print("⚠ Неизвестный пункт меню. Пожалуйста, укажите номер от 1 до 9, 'a', 'i', 'f' или '0'.")</w:t>
+              <w:br/>
               <w:t xml:space="preserve">            continue</w:t>
               <w:br/>
               <w:br/>
-              <w:t xml:space="preserve">        for stage in stages:</w:t>
-              <w:br/>
-              <w:t xml:space="preserve">            print()</w:t>
-              <w:br/>
-              <w:t xml:space="preserve">            run_stage(stage, ctx)</w:t>
-              <w:br/>
-              <w:br/>
-              <w:t xml:space="preserve">        # ----- пауза после выполнения -----</w:t>
-              <w:br/>
-              <w:t xml:space="preserve">        print()</w:t>
+              <w:t xml:space="preserve">        for stage_code in stages:</w:t>
+              <w:br/>
+              <w:t xml:space="preserve">            try:</w:t>
+              <w:br/>
+              <w:t xml:space="preserve">                run_stage(stage_code, ctx)</w:t>
+              <w:br/>
+              <w:t xml:space="preserve">            except Exception as err:</w:t>
+              <w:br/>
+              <w:t xml:space="preserve">                print(f"⚠ Ошибка при выполнении этапа {stage_code}: {err}")</w:t>
+              <w:br/>
+              <w:br/>
+              <w:t xml:space="preserve">        # Удобная пауза для изучения результатов перед обновлением меню</w:t>
+              <w:br/>
+              <w:t xml:space="preserve">        print("\n" + "─" * 76)</w:t>
               <w:br/>
               <w:t xml:space="preserve">        try:</w:t>
               <w:br/>
-              <w:t xml:space="preserve">            again = input("Enter или 0: ").strip().lower()</w:t>
+              <w:t xml:space="preserve">            input("Нажмите Enter для возврата в главное меню (или 0 для выхода)... ")</w:t>
               <w:br/>
               <w:t xml:space="preserve">        except (EOFError, KeyboardInterrupt):</w:t>
               <w:br/>
-              <w:t xml:space="preserve">            print("\nВыход.")</w:t>
+              <w:t xml:space="preserve">            print("\nРабота программы завершена.")</w:t>
               <w:br/>
               <w:t xml:space="preserve">            return</w:t>
               <w:br/>
               <w:br/>
-              <w:t xml:space="preserve">        if again in ("0", "q", "quit", "exit"):</w:t>
-              <w:br/>
-              <w:t xml:space="preserve">            print("Выход.")</w:t>
-              <w:br/>
-              <w:t xml:space="preserve">            return</w:t>
-              <w:br/>
-              <w:br/>
-              <w:t># ---------- main ----------</w:t>
+              <w:br/>
+              <w:t># =========================================================================</w:t>
+              <w:br/>
+              <w:t># ТОЧКА ВХОДА CLI</w:t>
+              <w:br/>
+              <w:t># =========================================================================</w:t>
               <w:br/>
               <w:br/>
               <w:t>def main() -&gt; None:</w:t>
               <w:br/>
+              <w:t xml:space="preserve">    """Точка входа консольного приложения."""</w:t>
+              <w:br/>
               <w:t xml:space="preserve">    if sys.platform == "win32":</w:t>
               <w:br/>
               <w:t xml:space="preserve">        try:</w:t>
@@ -12908,10 +13389,10 @@
               <w:t xml:space="preserve">            pass</w:t>
               <w:br/>
               <w:br/>
-              <w:t xml:space="preserve">    filepath = sys.argv[1] if len(sys.argv) &gt; 1 else DEFAULT_INPUT</w:t>
-              <w:br/>
-              <w:br/>
-              <w:t xml:space="preserve">    ctx = Context(filepath)</w:t>
+              <w:t xml:space="preserve">    target_file = sys.argv[1] if len(sys.argv) &gt; 1 else DEFAULT_INPUT</w:t>
+              <w:br/>
+              <w:t xml:space="preserve">    ctx = Context(target_file)</w:t>
+              <w:br/>
               <w:br/>
               <w:t xml:space="preserve">    try:</w:t>
               <w:br/>
@@ -12919,14 +13400,13 @@
               <w:br/>
               <w:t xml:space="preserve">    except FileNotFoundError:</w:t>
               <w:br/>
-              <w:t xml:space="preserve">        print(f"Файл не найден: {filepath}")</w:t>
-              <w:br/>
-              <w:t xml:space="preserve">        # Всё равно даём шанс ввести другой файл в интерактиве</w:t>
+              <w:t xml:space="preserve">        print(f"⚠ Файл '{target_file}' не найден. Создаём сессию по умолчанию.")</w:t>
               <w:br/>
               <w:t xml:space="preserve">        ctx = Context(DEFAULT_INPUT)</w:t>
               <w:br/>
               <w:br/>
               <w:t xml:space="preserve">    repl(ctx)</w:t>
+              <w:br/>
               <w:br/>
               <w:br/>
               <w:t>if __name__ == "__main__":</w:t>

</xml_diff>